<commit_message>
Update Gift Pokemon and Patch
</commit_message>
<xml_diff>
--- a/Yellow Kaizo Patch and Important Documents/Gift, Trade, Static Pokemon Encounters.docx
+++ b/Yellow Kaizo Patch and Important Documents/Gift, Trade, Static Pokemon Encounters.docx
@@ -1067,10 +1067,10 @@
                   <v:path o:extrusionok="f" gradientshapeok="t" o:connecttype="rect"/>
                   <o:lock v:ext="edit" aspectratio="t"/>
                 </v:shapetype>
-                <v:shape id="_x0000_i1025" type="#_x0000_t75" style="width:66pt;height:48.75pt" o:ole="">
+                <v:shape id="_x0000_i1025" type="#_x0000_t75" style="width:65.95pt;height:48.6pt" o:ole="">
                   <v:imagedata r:id="rId8" o:title=""/>
                 </v:shape>
-                <o:OLEObject Type="Embed" ProgID="PBrush" ShapeID="_x0000_i1025" DrawAspect="Content" ObjectID="_1832739327" r:id="rId9"/>
+                <o:OLEObject Type="Embed" ProgID="PBrush" ShapeID="_x0000_i1025" DrawAspect="Content" ObjectID="_1833353766" r:id="rId9"/>
               </w:object>
             </w:r>
           </w:p>
@@ -2667,15 +2667,16 @@
           <w:p>
             <w:pPr>
               <w:rPr>
-                <w:lang w:val="en"/>
-              </w:rPr>
-            </w:pPr>
-            <w:r>
-              <w:object w:dxaOrig="1020" w:dyaOrig="1050" w14:anchorId="0164CEC9">
-                <v:shape id="_x0000_i1026" type="#_x0000_t75" style="width:57pt;height:57.75pt" o:ole="">
+                <w:noProof/>
+                <w:lang w:val="en"/>
+              </w:rPr>
+            </w:pPr>
+            <w:r>
+              <w:object w:dxaOrig="1530" w:dyaOrig="1455" w14:anchorId="19E684E8">
+                <v:shape id="_x0000_i1054" type="#_x0000_t75" style="width:64.2pt;height:61.6pt" o:ole="">
                   <v:imagedata r:id="rId17" o:title=""/>
                 </v:shape>
-                <o:OLEObject Type="Embed" ProgID="PBrush" ShapeID="_x0000_i1026" DrawAspect="Content" ObjectID="_1832739328" r:id="rId18"/>
+                <o:OLEObject Type="Embed" ProgID="PBrush" ShapeID="_x0000_i1054" DrawAspect="Content" ObjectID="_1833353767" r:id="rId18"/>
               </w:object>
             </w:r>
           </w:p>
@@ -2704,13 +2705,15 @@
                 <w:lang w:val="en"/>
               </w:rPr>
             </w:pPr>
-            <w:r>
-              <w:rPr>
-                <w:b/>
-                <w:lang w:val="en"/>
-              </w:rPr>
-              <w:t>Ditto</w:t>
-            </w:r>
+            <w:proofErr w:type="spellStart"/>
+            <w:r>
+              <w:rPr>
+                <w:b/>
+                <w:lang w:val="en"/>
+              </w:rPr>
+              <w:t>Machop</w:t>
+            </w:r>
+            <w:proofErr w:type="spellEnd"/>
           </w:p>
         </w:tc>
         <w:tc>
@@ -2771,7 +2774,7 @@
               <w:rPr>
                 <w:lang w:val="en"/>
               </w:rPr>
-              <w:t>Celadon Mansion Roof House</w:t>
+              <w:t>Lavendar Name Rater House</w:t>
             </w:r>
           </w:p>
         </w:tc>
@@ -2798,12 +2801,17 @@
             </w:tcMar>
           </w:tcPr>
           <w:p>
-            <w:r>
-              <w:object w:dxaOrig="1470" w:dyaOrig="1080" w14:anchorId="0DF9C489">
-                <v:shape id="_x0000_i1027" type="#_x0000_t75" style="width:58.5pt;height:43.5pt" o:ole="">
+            <w:pPr>
+              <w:rPr>
+                <w:lang w:val="en"/>
+              </w:rPr>
+            </w:pPr>
+            <w:r>
+              <w:object w:dxaOrig="1020" w:dyaOrig="1050" w14:anchorId="0164CEC9">
+                <v:shape id="_x0000_i1026" type="#_x0000_t75" style="width:57.25pt;height:58.1pt" o:ole="">
                   <v:imagedata r:id="rId19" o:title=""/>
                 </v:shape>
-                <o:OLEObject Type="Embed" ProgID="PBrush" ShapeID="_x0000_i1027" DrawAspect="Content" ObjectID="_1832739329" r:id="rId20"/>
+                <o:OLEObject Type="Embed" ProgID="PBrush" ShapeID="_x0000_i1026" DrawAspect="Content" ObjectID="_1833353768" r:id="rId20"/>
               </w:object>
             </w:r>
           </w:p>
@@ -2832,15 +2840,13 @@
                 <w:lang w:val="en"/>
               </w:rPr>
             </w:pPr>
-            <w:proofErr w:type="spellStart"/>
-            <w:r>
-              <w:rPr>
-                <w:b/>
-                <w:lang w:val="en"/>
-              </w:rPr>
-              <w:t>Poliwag</w:t>
-            </w:r>
-            <w:proofErr w:type="spellEnd"/>
+            <w:r>
+              <w:rPr>
+                <w:b/>
+                <w:lang w:val="en"/>
+              </w:rPr>
+              <w:t>Ditto</w:t>
+            </w:r>
           </w:p>
         </w:tc>
         <w:tc>
@@ -2901,7 +2907,7 @@
               <w:rPr>
                 <w:lang w:val="en"/>
               </w:rPr>
-              <w:t>Route 12 Super Rod House</w:t>
+              <w:t>Celadon Mansion Roof House</w:t>
             </w:r>
           </w:p>
         </w:tc>
@@ -2929,11 +2935,11 @@
           </w:tcPr>
           <w:p>
             <w:r>
-              <w:object w:dxaOrig="1095" w:dyaOrig="840" w14:anchorId="392636D3">
-                <v:shape id="_x0000_i1028" type="#_x0000_t75" style="width:54.75pt;height:41.25pt" o:ole="">
+              <w:object w:dxaOrig="1470" w:dyaOrig="1080" w14:anchorId="0DF9C489">
+                <v:shape id="_x0000_i1027" type="#_x0000_t75" style="width:58.1pt;height:43.35pt" o:ole="">
                   <v:imagedata r:id="rId21" o:title=""/>
                 </v:shape>
-                <o:OLEObject Type="Embed" ProgID="PBrush" ShapeID="_x0000_i1028" DrawAspect="Content" ObjectID="_1832739330" r:id="rId22"/>
+                <o:OLEObject Type="Embed" ProgID="PBrush" ShapeID="_x0000_i1027" DrawAspect="Content" ObjectID="_1833353769" r:id="rId22"/>
               </w:object>
             </w:r>
           </w:p>
@@ -2968,7 +2974,7 @@
                 <w:b/>
                 <w:lang w:val="en"/>
               </w:rPr>
-              <w:t>Meowth</w:t>
+              <w:t>Poliwag</w:t>
             </w:r>
             <w:proofErr w:type="spellEnd"/>
           </w:p>
@@ -3031,7 +3037,7 @@
               <w:rPr>
                 <w:lang w:val="en"/>
               </w:rPr>
-              <w:t>Celadon Diner</w:t>
+              <w:t>Route 12 Super Rod House</w:t>
             </w:r>
           </w:p>
         </w:tc>
@@ -3059,11 +3065,141 @@
           </w:tcPr>
           <w:p>
             <w:r>
-              <w:object w:dxaOrig="1320" w:dyaOrig="1125" w14:anchorId="3B8C00FC">
-                <v:shape id="_x0000_i1029" type="#_x0000_t75" style="width:58.5pt;height:55.5pt" o:ole="">
+              <w:object w:dxaOrig="1095" w:dyaOrig="840" w14:anchorId="392636D3">
+                <v:shape id="_x0000_i1028" type="#_x0000_t75" style="width:54.65pt;height:41.65pt" o:ole="">
                   <v:imagedata r:id="rId23" o:title=""/>
                 </v:shape>
-                <o:OLEObject Type="Embed" ProgID="PBrush" ShapeID="_x0000_i1029" DrawAspect="Content" ObjectID="_1832739331" r:id="rId24"/>
+                <o:OLEObject Type="Embed" ProgID="PBrush" ShapeID="_x0000_i1028" DrawAspect="Content" ObjectID="_1833353770" r:id="rId24"/>
+              </w:object>
+            </w:r>
+          </w:p>
+        </w:tc>
+        <w:tc>
+          <w:tcPr>
+            <w:tcW w:w="2340" w:type="dxa"/>
+            <w:tcBorders>
+              <w:top w:val="single" w:sz="8" w:space="0" w:color="000000"/>
+              <w:left w:val="single" w:sz="8" w:space="0" w:color="000000"/>
+              <w:bottom w:val="single" w:sz="8" w:space="0" w:color="000000"/>
+              <w:right w:val="single" w:sz="8" w:space="0" w:color="000000"/>
+            </w:tcBorders>
+            <w:shd w:val="clear" w:color="auto" w:fill="B6D7A8"/>
+            <w:tcMar>
+              <w:top w:w="100" w:type="dxa"/>
+              <w:left w:w="100" w:type="dxa"/>
+              <w:bottom w:w="100" w:type="dxa"/>
+              <w:right w:w="100" w:type="dxa"/>
+            </w:tcMar>
+          </w:tcPr>
+          <w:p>
+            <w:pPr>
+              <w:rPr>
+                <w:b/>
+                <w:lang w:val="en"/>
+              </w:rPr>
+            </w:pPr>
+            <w:proofErr w:type="spellStart"/>
+            <w:r>
+              <w:rPr>
+                <w:b/>
+                <w:lang w:val="en"/>
+              </w:rPr>
+              <w:t>Meowth</w:t>
+            </w:r>
+            <w:proofErr w:type="spellEnd"/>
+          </w:p>
+        </w:tc>
+        <w:tc>
+          <w:tcPr>
+            <w:tcW w:w="1065" w:type="dxa"/>
+            <w:tcBorders>
+              <w:top w:val="single" w:sz="8" w:space="0" w:color="000000"/>
+              <w:left w:val="single" w:sz="8" w:space="0" w:color="000000"/>
+              <w:bottom w:val="single" w:sz="8" w:space="0" w:color="000000"/>
+              <w:right w:val="single" w:sz="8" w:space="0" w:color="000000"/>
+            </w:tcBorders>
+            <w:shd w:val="clear" w:color="auto" w:fill="B6D7A8"/>
+            <w:tcMar>
+              <w:top w:w="100" w:type="dxa"/>
+              <w:left w:w="100" w:type="dxa"/>
+              <w:bottom w:w="100" w:type="dxa"/>
+              <w:right w:w="100" w:type="dxa"/>
+            </w:tcMar>
+          </w:tcPr>
+          <w:p>
+            <w:pPr>
+              <w:rPr>
+                <w:lang w:val="en"/>
+              </w:rPr>
+            </w:pPr>
+            <w:r>
+              <w:rPr>
+                <w:lang w:val="en"/>
+              </w:rPr>
+              <w:t>30</w:t>
+            </w:r>
+          </w:p>
+        </w:tc>
+        <w:tc>
+          <w:tcPr>
+            <w:tcW w:w="3495" w:type="dxa"/>
+            <w:tcBorders>
+              <w:top w:val="single" w:sz="8" w:space="0" w:color="000000"/>
+              <w:left w:val="single" w:sz="8" w:space="0" w:color="000000"/>
+              <w:bottom w:val="single" w:sz="8" w:space="0" w:color="000000"/>
+              <w:right w:val="single" w:sz="8" w:space="0" w:color="000000"/>
+            </w:tcBorders>
+            <w:shd w:val="clear" w:color="auto" w:fill="B6D7A8"/>
+            <w:tcMar>
+              <w:top w:w="100" w:type="dxa"/>
+              <w:left w:w="100" w:type="dxa"/>
+              <w:bottom w:w="100" w:type="dxa"/>
+              <w:right w:w="100" w:type="dxa"/>
+            </w:tcMar>
+          </w:tcPr>
+          <w:p>
+            <w:pPr>
+              <w:rPr>
+                <w:lang w:val="en"/>
+              </w:rPr>
+            </w:pPr>
+            <w:r>
+              <w:rPr>
+                <w:lang w:val="en"/>
+              </w:rPr>
+              <w:t>Celadon Diner</w:t>
+            </w:r>
+          </w:p>
+        </w:tc>
+      </w:tr>
+      <w:tr>
+        <w:trPr>
+          <w:jc w:val="center"/>
+        </w:trPr>
+        <w:tc>
+          <w:tcPr>
+            <w:tcW w:w="1365" w:type="dxa"/>
+            <w:tcBorders>
+              <w:top w:val="single" w:sz="8" w:space="0" w:color="000000"/>
+              <w:left w:val="single" w:sz="8" w:space="0" w:color="000000"/>
+              <w:bottom w:val="single" w:sz="8" w:space="0" w:color="000000"/>
+              <w:right w:val="single" w:sz="8" w:space="0" w:color="000000"/>
+            </w:tcBorders>
+            <w:shd w:val="clear" w:color="auto" w:fill="B6D7A8"/>
+            <w:tcMar>
+              <w:top w:w="100" w:type="dxa"/>
+              <w:left w:w="100" w:type="dxa"/>
+              <w:bottom w:w="100" w:type="dxa"/>
+              <w:right w:w="100" w:type="dxa"/>
+            </w:tcMar>
+          </w:tcPr>
+          <w:p>
+            <w:r>
+              <w:object w:dxaOrig="1320" w:dyaOrig="1125" w14:anchorId="3B8C00FC">
+                <v:shape id="_x0000_i1029" type="#_x0000_t75" style="width:58.1pt;height:55.5pt" o:ole="">
+                  <v:imagedata r:id="rId25" o:title=""/>
+                </v:shape>
+                <o:OLEObject Type="Embed" ProgID="PBrush" ShapeID="_x0000_i1029" DrawAspect="Content" ObjectID="_1833353771" r:id="rId26"/>
               </w:object>
             </w:r>
           </w:p>
@@ -3212,481 +3348,6 @@
                       <pic:pic xmlns:pic="http://schemas.openxmlformats.org/drawingml/2006/picture">
                         <pic:nvPicPr>
                           <pic:cNvPr id="0" name="image124.png"/>
-                          <pic:cNvPicPr>
-                            <a:picLocks noChangeAspect="1" noChangeArrowheads="1"/>
-                          </pic:cNvPicPr>
-                        </pic:nvPicPr>
-                        <pic:blipFill>
-                          <a:blip r:embed="rId25">
-                            <a:extLst>
-                              <a:ext uri="{28A0092B-C50C-407E-A947-70E740481C1C}">
-                                <a14:useLocalDpi xmlns:a14="http://schemas.microsoft.com/office/drawing/2010/main" val="0"/>
-                              </a:ext>
-                            </a:extLst>
-                          </a:blip>
-                          <a:srcRect/>
-                          <a:stretch>
-                            <a:fillRect/>
-                          </a:stretch>
-                        </pic:blipFill>
-                        <pic:spPr bwMode="auto">
-                          <a:xfrm>
-                            <a:off x="0" y="0"/>
-                            <a:ext cx="695325" cy="695325"/>
-                          </a:xfrm>
-                          <a:prstGeom prst="rect">
-                            <a:avLst/>
-                          </a:prstGeom>
-                          <a:noFill/>
-                          <a:ln>
-                            <a:noFill/>
-                          </a:ln>
-                        </pic:spPr>
-                      </pic:pic>
-                    </a:graphicData>
-                  </a:graphic>
-                </wp:inline>
-              </w:drawing>
-            </w:r>
-          </w:p>
-        </w:tc>
-        <w:tc>
-          <w:tcPr>
-            <w:tcW w:w="2340" w:type="dxa"/>
-            <w:tcBorders>
-              <w:top w:val="single" w:sz="8" w:space="0" w:color="000000"/>
-              <w:left w:val="single" w:sz="8" w:space="0" w:color="000000"/>
-              <w:bottom w:val="single" w:sz="8" w:space="0" w:color="000000"/>
-              <w:right w:val="single" w:sz="8" w:space="0" w:color="000000"/>
-            </w:tcBorders>
-            <w:shd w:val="clear" w:color="auto" w:fill="A4C2F4"/>
-            <w:tcMar>
-              <w:top w:w="100" w:type="dxa"/>
-              <w:left w:w="100" w:type="dxa"/>
-              <w:bottom w:w="100" w:type="dxa"/>
-              <w:right w:w="100" w:type="dxa"/>
-            </w:tcMar>
-            <w:hideMark/>
-          </w:tcPr>
-          <w:p>
-            <w:pPr>
-              <w:rPr>
-                <w:b/>
-                <w:lang w:val="en"/>
-              </w:rPr>
-            </w:pPr>
-            <w:proofErr w:type="spellStart"/>
-            <w:r>
-              <w:rPr>
-                <w:b/>
-                <w:lang w:val="en"/>
-              </w:rPr>
-              <w:t>Marowak</w:t>
-            </w:r>
-            <w:proofErr w:type="spellEnd"/>
-          </w:p>
-          <w:p>
-            <w:pPr>
-              <w:rPr>
-                <w:b/>
-                <w:lang w:val="en"/>
-              </w:rPr>
-            </w:pPr>
-            <w:r>
-              <w:rPr>
-                <w:b/>
-                <w:lang w:val="en"/>
-              </w:rPr>
-              <w:t>(Ghost)</w:t>
-            </w:r>
-          </w:p>
-        </w:tc>
-        <w:tc>
-          <w:tcPr>
-            <w:tcW w:w="1065" w:type="dxa"/>
-            <w:tcBorders>
-              <w:top w:val="single" w:sz="8" w:space="0" w:color="000000"/>
-              <w:left w:val="single" w:sz="8" w:space="0" w:color="000000"/>
-              <w:bottom w:val="single" w:sz="8" w:space="0" w:color="000000"/>
-              <w:right w:val="single" w:sz="8" w:space="0" w:color="000000"/>
-            </w:tcBorders>
-            <w:shd w:val="clear" w:color="auto" w:fill="A4C2F4"/>
-            <w:tcMar>
-              <w:top w:w="100" w:type="dxa"/>
-              <w:left w:w="100" w:type="dxa"/>
-              <w:bottom w:w="100" w:type="dxa"/>
-              <w:right w:w="100" w:type="dxa"/>
-            </w:tcMar>
-            <w:hideMark/>
-          </w:tcPr>
-          <w:p>
-            <w:pPr>
-              <w:rPr>
-                <w:lang w:val="en"/>
-              </w:rPr>
-            </w:pPr>
-            <w:r>
-              <w:rPr>
-                <w:lang w:val="en"/>
-              </w:rPr>
-              <w:t>35</w:t>
-            </w:r>
-          </w:p>
-        </w:tc>
-        <w:tc>
-          <w:tcPr>
-            <w:tcW w:w="3495" w:type="dxa"/>
-            <w:tcBorders>
-              <w:top w:val="single" w:sz="8" w:space="0" w:color="000000"/>
-              <w:left w:val="single" w:sz="8" w:space="0" w:color="000000"/>
-              <w:bottom w:val="single" w:sz="8" w:space="0" w:color="000000"/>
-              <w:right w:val="single" w:sz="8" w:space="0" w:color="000000"/>
-            </w:tcBorders>
-            <w:shd w:val="clear" w:color="auto" w:fill="A4C2F4"/>
-            <w:tcMar>
-              <w:top w:w="100" w:type="dxa"/>
-              <w:left w:w="100" w:type="dxa"/>
-              <w:bottom w:w="100" w:type="dxa"/>
-              <w:right w:w="100" w:type="dxa"/>
-            </w:tcMar>
-            <w:hideMark/>
-          </w:tcPr>
-          <w:p>
-            <w:pPr>
-              <w:rPr>
-                <w:lang w:val="en"/>
-              </w:rPr>
-            </w:pPr>
-            <w:r>
-              <w:rPr>
-                <w:lang w:val="en"/>
-              </w:rPr>
-              <w:t>Pokémon Tower</w:t>
-            </w:r>
-          </w:p>
-          <w:p>
-            <w:pPr>
-              <w:rPr>
-                <w:lang w:val="en"/>
-              </w:rPr>
-            </w:pPr>
-            <w:r>
-              <w:rPr>
-                <w:lang w:val="en"/>
-              </w:rPr>
-              <w:t xml:space="preserve">(Must obtain </w:t>
-            </w:r>
-            <w:proofErr w:type="spellStart"/>
-            <w:r>
-              <w:rPr>
-                <w:lang w:val="en"/>
-              </w:rPr>
-              <w:t>Silph</w:t>
-            </w:r>
-            <w:proofErr w:type="spellEnd"/>
-            <w:r>
-              <w:rPr>
-                <w:lang w:val="en"/>
-              </w:rPr>
-              <w:t xml:space="preserve"> Scope)</w:t>
-            </w:r>
-          </w:p>
-          <w:p>
-            <w:pPr>
-              <w:rPr>
-                <w:b/>
-                <w:lang w:val="en"/>
-              </w:rPr>
-            </w:pPr>
-            <w:r>
-              <w:rPr>
-                <w:b/>
-                <w:lang w:val="en"/>
-              </w:rPr>
-              <w:t xml:space="preserve">Cannot </w:t>
-            </w:r>
-            <w:r>
-              <w:rPr>
-                <w:b/>
-                <w:lang w:val="en"/>
-              </w:rPr>
-              <w:t>B</w:t>
-            </w:r>
-            <w:r>
-              <w:rPr>
-                <w:b/>
-                <w:lang w:val="en"/>
-              </w:rPr>
-              <w:t xml:space="preserve">e </w:t>
-            </w:r>
-            <w:r>
-              <w:rPr>
-                <w:b/>
-                <w:lang w:val="en"/>
-              </w:rPr>
-              <w:t>C</w:t>
-            </w:r>
-            <w:r>
-              <w:rPr>
-                <w:b/>
-                <w:lang w:val="en"/>
-              </w:rPr>
-              <w:t>aught</w:t>
-            </w:r>
-            <w:r>
-              <w:rPr>
-                <w:b/>
-                <w:lang w:val="en"/>
-              </w:rPr>
-              <w:t>…</w:t>
-            </w:r>
-          </w:p>
-        </w:tc>
-      </w:tr>
-      <w:tr>
-        <w:trPr>
-          <w:jc w:val="center"/>
-        </w:trPr>
-        <w:tc>
-          <w:tcPr>
-            <w:tcW w:w="1365" w:type="dxa"/>
-            <w:tcBorders>
-              <w:top w:val="single" w:sz="8" w:space="0" w:color="000000"/>
-              <w:left w:val="single" w:sz="8" w:space="0" w:color="000000"/>
-              <w:bottom w:val="single" w:sz="8" w:space="0" w:color="000000"/>
-              <w:right w:val="single" w:sz="8" w:space="0" w:color="000000"/>
-            </w:tcBorders>
-            <w:shd w:val="clear" w:color="auto" w:fill="A4C2F4"/>
-            <w:tcMar>
-              <w:top w:w="100" w:type="dxa"/>
-              <w:left w:w="100" w:type="dxa"/>
-              <w:bottom w:w="100" w:type="dxa"/>
-              <w:right w:w="100" w:type="dxa"/>
-            </w:tcMar>
-            <w:hideMark/>
-          </w:tcPr>
-          <w:p>
-            <w:pPr>
-              <w:rPr>
-                <w:lang w:val="en"/>
-              </w:rPr>
-            </w:pPr>
-            <w:r>
-              <w:rPr>
-                <w:noProof/>
-                <w:lang w:val="en"/>
-              </w:rPr>
-              <w:drawing>
-                <wp:inline distT="0" distB="0" distL="0" distR="0" wp14:anchorId="54A26341" wp14:editId="7EB46FB7">
-                  <wp:extent cx="695325" cy="695325"/>
-                  <wp:effectExtent l="0" t="0" r="9525" b="9525"/>
-                  <wp:docPr id="1766683897" name="Picture 56"/>
-                  <wp:cNvGraphicFramePr>
-                    <a:graphicFrameLocks xmlns:a="http://schemas.openxmlformats.org/drawingml/2006/main" noChangeAspect="1"/>
-                  </wp:cNvGraphicFramePr>
-                  <a:graphic xmlns:a="http://schemas.openxmlformats.org/drawingml/2006/main">
-                    <a:graphicData uri="http://schemas.openxmlformats.org/drawingml/2006/picture">
-                      <pic:pic xmlns:pic="http://schemas.openxmlformats.org/drawingml/2006/picture">
-                        <pic:nvPicPr>
-                          <pic:cNvPr id="0" name="image9.png"/>
-                          <pic:cNvPicPr>
-                            <a:picLocks noChangeAspect="1" noChangeArrowheads="1"/>
-                          </pic:cNvPicPr>
-                        </pic:nvPicPr>
-                        <pic:blipFill>
-                          <a:blip r:embed="rId26">
-                            <a:extLst>
-                              <a:ext uri="{28A0092B-C50C-407E-A947-70E740481C1C}">
-                                <a14:useLocalDpi xmlns:a14="http://schemas.microsoft.com/office/drawing/2010/main" val="0"/>
-                              </a:ext>
-                            </a:extLst>
-                          </a:blip>
-                          <a:srcRect/>
-                          <a:stretch>
-                            <a:fillRect/>
-                          </a:stretch>
-                        </pic:blipFill>
-                        <pic:spPr bwMode="auto">
-                          <a:xfrm>
-                            <a:off x="0" y="0"/>
-                            <a:ext cx="695325" cy="695325"/>
-                          </a:xfrm>
-                          <a:prstGeom prst="rect">
-                            <a:avLst/>
-                          </a:prstGeom>
-                          <a:noFill/>
-                          <a:ln>
-                            <a:noFill/>
-                          </a:ln>
-                        </pic:spPr>
-                      </pic:pic>
-                    </a:graphicData>
-                  </a:graphic>
-                </wp:inline>
-              </w:drawing>
-            </w:r>
-          </w:p>
-        </w:tc>
-        <w:tc>
-          <w:tcPr>
-            <w:tcW w:w="2340" w:type="dxa"/>
-            <w:tcBorders>
-              <w:top w:val="single" w:sz="8" w:space="0" w:color="000000"/>
-              <w:left w:val="single" w:sz="8" w:space="0" w:color="000000"/>
-              <w:bottom w:val="single" w:sz="8" w:space="0" w:color="000000"/>
-              <w:right w:val="single" w:sz="8" w:space="0" w:color="000000"/>
-            </w:tcBorders>
-            <w:shd w:val="clear" w:color="auto" w:fill="A4C2F4"/>
-            <w:tcMar>
-              <w:top w:w="100" w:type="dxa"/>
-              <w:left w:w="100" w:type="dxa"/>
-              <w:bottom w:w="100" w:type="dxa"/>
-              <w:right w:w="100" w:type="dxa"/>
-            </w:tcMar>
-            <w:hideMark/>
-          </w:tcPr>
-          <w:p>
-            <w:pPr>
-              <w:rPr>
-                <w:b/>
-                <w:lang w:val="en"/>
-              </w:rPr>
-            </w:pPr>
-            <w:proofErr w:type="spellStart"/>
-            <w:r>
-              <w:rPr>
-                <w:b/>
-                <w:lang w:val="en"/>
-              </w:rPr>
-              <w:t>Snorlax</w:t>
-            </w:r>
-            <w:proofErr w:type="spellEnd"/>
-          </w:p>
-        </w:tc>
-        <w:tc>
-          <w:tcPr>
-            <w:tcW w:w="1065" w:type="dxa"/>
-            <w:tcBorders>
-              <w:top w:val="single" w:sz="8" w:space="0" w:color="000000"/>
-              <w:left w:val="single" w:sz="8" w:space="0" w:color="000000"/>
-              <w:bottom w:val="single" w:sz="8" w:space="0" w:color="000000"/>
-              <w:right w:val="single" w:sz="8" w:space="0" w:color="000000"/>
-            </w:tcBorders>
-            <w:shd w:val="clear" w:color="auto" w:fill="A4C2F4"/>
-            <w:tcMar>
-              <w:top w:w="100" w:type="dxa"/>
-              <w:left w:w="100" w:type="dxa"/>
-              <w:bottom w:w="100" w:type="dxa"/>
-              <w:right w:w="100" w:type="dxa"/>
-            </w:tcMar>
-            <w:hideMark/>
-          </w:tcPr>
-          <w:p>
-            <w:pPr>
-              <w:rPr>
-                <w:lang w:val="en"/>
-              </w:rPr>
-            </w:pPr>
-            <w:r>
-              <w:rPr>
-                <w:lang w:val="en"/>
-              </w:rPr>
-              <w:t>30</w:t>
-            </w:r>
-          </w:p>
-        </w:tc>
-        <w:tc>
-          <w:tcPr>
-            <w:tcW w:w="3495" w:type="dxa"/>
-            <w:tcBorders>
-              <w:top w:val="single" w:sz="8" w:space="0" w:color="000000"/>
-              <w:left w:val="single" w:sz="8" w:space="0" w:color="000000"/>
-              <w:bottom w:val="single" w:sz="8" w:space="0" w:color="000000"/>
-              <w:right w:val="single" w:sz="8" w:space="0" w:color="000000"/>
-            </w:tcBorders>
-            <w:shd w:val="clear" w:color="auto" w:fill="A4C2F4"/>
-            <w:tcMar>
-              <w:top w:w="100" w:type="dxa"/>
-              <w:left w:w="100" w:type="dxa"/>
-              <w:bottom w:w="100" w:type="dxa"/>
-              <w:right w:w="100" w:type="dxa"/>
-            </w:tcMar>
-            <w:hideMark/>
-          </w:tcPr>
-          <w:p>
-            <w:pPr>
-              <w:rPr>
-                <w:lang w:val="en"/>
-              </w:rPr>
-            </w:pPr>
-            <w:r>
-              <w:rPr>
-                <w:lang w:val="en"/>
-              </w:rPr>
-              <w:t>Route 12 &amp; Route 16</w:t>
-            </w:r>
-          </w:p>
-          <w:p>
-            <w:pPr>
-              <w:rPr>
-                <w:lang w:val="en"/>
-              </w:rPr>
-            </w:pPr>
-            <w:r>
-              <w:rPr>
-                <w:lang w:val="en"/>
-              </w:rPr>
-              <w:t>(Must obtain and use Poke Flute)</w:t>
-            </w:r>
-          </w:p>
-        </w:tc>
-      </w:tr>
-      <w:tr>
-        <w:trPr>
-          <w:jc w:val="center"/>
-        </w:trPr>
-        <w:tc>
-          <w:tcPr>
-            <w:tcW w:w="1365" w:type="dxa"/>
-            <w:tcBorders>
-              <w:top w:val="single" w:sz="8" w:space="0" w:color="000000"/>
-              <w:left w:val="single" w:sz="8" w:space="0" w:color="000000"/>
-              <w:bottom w:val="single" w:sz="8" w:space="0" w:color="000000"/>
-              <w:right w:val="single" w:sz="8" w:space="0" w:color="000000"/>
-            </w:tcBorders>
-            <w:shd w:val="clear" w:color="auto" w:fill="A4C2F4"/>
-            <w:tcMar>
-              <w:top w:w="100" w:type="dxa"/>
-              <w:left w:w="100" w:type="dxa"/>
-              <w:bottom w:w="100" w:type="dxa"/>
-              <w:right w:w="100" w:type="dxa"/>
-            </w:tcMar>
-            <w:hideMark/>
-          </w:tcPr>
-          <w:p>
-            <w:pPr>
-              <w:rPr>
-                <w:lang w:val="en"/>
-              </w:rPr>
-            </w:pPr>
-            <w:r>
-              <w:rPr>
-                <w:noProof/>
-                <w:lang w:val="en"/>
-              </w:rPr>
-              <w:drawing>
-                <wp:inline distT="0" distB="0" distL="0" distR="0" wp14:anchorId="74C69DF6" wp14:editId="0F633955">
-                  <wp:extent cx="695325" cy="695325"/>
-                  <wp:effectExtent l="0" t="0" r="9525" b="9525"/>
-                  <wp:docPr id="1271015874" name="Picture 55"/>
-                  <wp:cNvGraphicFramePr>
-                    <a:graphicFrameLocks xmlns:a="http://schemas.openxmlformats.org/drawingml/2006/main" noChangeAspect="1"/>
-                  </wp:cNvGraphicFramePr>
-                  <a:graphic xmlns:a="http://schemas.openxmlformats.org/drawingml/2006/main">
-                    <a:graphicData uri="http://schemas.openxmlformats.org/drawingml/2006/picture">
-                      <pic:pic xmlns:pic="http://schemas.openxmlformats.org/drawingml/2006/picture">
-                        <pic:nvPicPr>
-                          <pic:cNvPr id="0" name="image112.png"/>
                           <pic:cNvPicPr>
                             <a:picLocks noChangeAspect="1" noChangeArrowheads="1"/>
                           </pic:cNvPicPr>
@@ -3756,10 +3417,25 @@
                 <w:b/>
                 <w:lang w:val="en"/>
               </w:rPr>
-              <w:t>Articuno</w:t>
+              <w:t>Marowak</w:t>
             </w:r>
             <w:proofErr w:type="spellEnd"/>
           </w:p>
+          <w:p>
+            <w:pPr>
+              <w:rPr>
+                <w:b/>
+                <w:lang w:val="en"/>
+              </w:rPr>
+            </w:pPr>
+            <w:r>
+              <w:rPr>
+                <w:b/>
+                <w:lang w:val="en"/>
+              </w:rPr>
+              <w:t>(Ghost)</w:t>
+            </w:r>
+          </w:p>
         </w:tc>
         <w:tc>
           <w:tcPr>
@@ -3789,7 +3465,7 @@
               <w:rPr>
                 <w:lang w:val="en"/>
               </w:rPr>
-              <w:t>100</w:t>
+              <w:t>35</w:t>
             </w:r>
           </w:p>
         </w:tc>
@@ -3821,7 +3497,84 @@
               <w:rPr>
                 <w:lang w:val="en"/>
               </w:rPr>
-              <w:t>Cerulean Cave</w:t>
+              <w:t>Pokémon Tower</w:t>
+            </w:r>
+          </w:p>
+          <w:p>
+            <w:pPr>
+              <w:rPr>
+                <w:lang w:val="en"/>
+              </w:rPr>
+            </w:pPr>
+            <w:r>
+              <w:rPr>
+                <w:lang w:val="en"/>
+              </w:rPr>
+              <w:t xml:space="preserve">(Must obtain </w:t>
+            </w:r>
+            <w:proofErr w:type="spellStart"/>
+            <w:r>
+              <w:rPr>
+                <w:lang w:val="en"/>
+              </w:rPr>
+              <w:t>Silph</w:t>
+            </w:r>
+            <w:proofErr w:type="spellEnd"/>
+            <w:r>
+              <w:rPr>
+                <w:lang w:val="en"/>
+              </w:rPr>
+              <w:t xml:space="preserve"> Scope)</w:t>
+            </w:r>
+          </w:p>
+          <w:p>
+            <w:pPr>
+              <w:rPr>
+                <w:b/>
+                <w:lang w:val="en"/>
+              </w:rPr>
+            </w:pPr>
+            <w:r>
+              <w:rPr>
+                <w:b/>
+                <w:lang w:val="en"/>
+              </w:rPr>
+              <w:t xml:space="preserve">Cannot </w:t>
+            </w:r>
+            <w:r>
+              <w:rPr>
+                <w:b/>
+                <w:lang w:val="en"/>
+              </w:rPr>
+              <w:t>B</w:t>
+            </w:r>
+            <w:r>
+              <w:rPr>
+                <w:b/>
+                <w:lang w:val="en"/>
+              </w:rPr>
+              <w:t xml:space="preserve">e </w:t>
+            </w:r>
+            <w:r>
+              <w:rPr>
+                <w:b/>
+                <w:lang w:val="en"/>
+              </w:rPr>
+              <w:t>C</w:t>
+            </w:r>
+            <w:r>
+              <w:rPr>
+                <w:b/>
+                <w:lang w:val="en"/>
+              </w:rPr>
+              <w:t>aught</w:t>
+            </w:r>
+            <w:r>
+              <w:rPr>
+                <w:b/>
+                <w:lang w:val="en"/>
+              </w:rPr>
+              <w:t>…</w:t>
             </w:r>
           </w:p>
         </w:tc>
@@ -3860,10 +3613,10 @@
                 <w:lang w:val="en"/>
               </w:rPr>
               <w:drawing>
-                <wp:inline distT="0" distB="0" distL="0" distR="0" wp14:anchorId="02A6CF0C" wp14:editId="3513BC61">
+                <wp:inline distT="0" distB="0" distL="0" distR="0" wp14:anchorId="54A26341" wp14:editId="7EB46FB7">
                   <wp:extent cx="695325" cy="695325"/>
-                  <wp:effectExtent l="0" t="0" r="0" b="0"/>
-                  <wp:docPr id="179651746" name="Picture 54"/>
+                  <wp:effectExtent l="0" t="0" r="9525" b="9525"/>
+                  <wp:docPr id="1766683897" name="Picture 56"/>
                   <wp:cNvGraphicFramePr>
                     <a:graphicFrameLocks xmlns:a="http://schemas.openxmlformats.org/drawingml/2006/main" noChangeAspect="1"/>
                   </wp:cNvGraphicFramePr>
@@ -3871,7 +3624,7 @@
                     <a:graphicData uri="http://schemas.openxmlformats.org/drawingml/2006/picture">
                       <pic:pic xmlns:pic="http://schemas.openxmlformats.org/drawingml/2006/picture">
                         <pic:nvPicPr>
-                          <pic:cNvPr id="0" name="image149.png"/>
+                          <pic:cNvPr id="0" name="image9.png"/>
                           <pic:cNvPicPr>
                             <a:picLocks noChangeAspect="1" noChangeArrowheads="1"/>
                           </pic:cNvPicPr>
@@ -3935,20 +3688,13 @@
                 <w:lang w:val="en"/>
               </w:rPr>
             </w:pPr>
-            <w:r>
-              <w:rPr>
-                <w:b/>
-                <w:lang w:val="en"/>
-              </w:rPr>
-              <w:t xml:space="preserve"> </w:t>
-            </w:r>
             <w:proofErr w:type="spellStart"/>
             <w:r>
               <w:rPr>
                 <w:b/>
                 <w:lang w:val="en"/>
               </w:rPr>
-              <w:t>Voltorb</w:t>
+              <w:t>Snorlax</w:t>
             </w:r>
             <w:proofErr w:type="spellEnd"/>
           </w:p>
@@ -3981,13 +3727,7 @@
               <w:rPr>
                 <w:lang w:val="en"/>
               </w:rPr>
-              <w:t>5</w:t>
-            </w:r>
-            <w:r>
-              <w:rPr>
-                <w:lang w:val="en"/>
-              </w:rPr>
-              <w:t>3</w:t>
+              <w:t>30</w:t>
             </w:r>
           </w:p>
         </w:tc>
@@ -4019,7 +3759,20 @@
               <w:rPr>
                 <w:lang w:val="en"/>
               </w:rPr>
-              <w:t>Power Plant</w:t>
+              <w:t>Route 12 &amp; Route 16</w:t>
+            </w:r>
+          </w:p>
+          <w:p>
+            <w:pPr>
+              <w:rPr>
+                <w:lang w:val="en"/>
+              </w:rPr>
+            </w:pPr>
+            <w:r>
+              <w:rPr>
+                <w:lang w:val="en"/>
+              </w:rPr>
+              <w:t>(Must obtain and use Poke Flute)</w:t>
             </w:r>
           </w:p>
         </w:tc>
@@ -4058,10 +3811,10 @@
                 <w:lang w:val="en"/>
               </w:rPr>
               <w:drawing>
-                <wp:inline distT="0" distB="0" distL="0" distR="0" wp14:anchorId="5461A965" wp14:editId="528CFB03">
+                <wp:inline distT="0" distB="0" distL="0" distR="0" wp14:anchorId="74C69DF6" wp14:editId="0F633955">
                   <wp:extent cx="695325" cy="695325"/>
-                  <wp:effectExtent l="0" t="0" r="0" b="9525"/>
-                  <wp:docPr id="1119180194" name="Picture 53"/>
+                  <wp:effectExtent l="0" t="0" r="9525" b="9525"/>
+                  <wp:docPr id="1271015874" name="Picture 55"/>
                   <wp:cNvGraphicFramePr>
                     <a:graphicFrameLocks xmlns:a="http://schemas.openxmlformats.org/drawingml/2006/main" noChangeAspect="1"/>
                   </wp:cNvGraphicFramePr>
@@ -4069,7 +3822,7 @@
                     <a:graphicData uri="http://schemas.openxmlformats.org/drawingml/2006/picture">
                       <pic:pic xmlns:pic="http://schemas.openxmlformats.org/drawingml/2006/picture">
                         <pic:nvPicPr>
-                          <pic:cNvPr id="0" name="image43.png"/>
+                          <pic:cNvPr id="0" name="image112.png"/>
                           <pic:cNvPicPr>
                             <a:picLocks noChangeAspect="1" noChangeArrowheads="1"/>
                           </pic:cNvPicPr>
@@ -4133,13 +3886,15 @@
                 <w:lang w:val="en"/>
               </w:rPr>
             </w:pPr>
-            <w:r>
-              <w:rPr>
-                <w:b/>
-                <w:lang w:val="en"/>
-              </w:rPr>
-              <w:t>Electrode</w:t>
-            </w:r>
+            <w:proofErr w:type="spellStart"/>
+            <w:r>
+              <w:rPr>
+                <w:b/>
+                <w:lang w:val="en"/>
+              </w:rPr>
+              <w:t>Articuno</w:t>
+            </w:r>
+            <w:proofErr w:type="spellEnd"/>
           </w:p>
         </w:tc>
         <w:tc>
@@ -4170,26 +3925,7 @@
               <w:rPr>
                 <w:lang w:val="en"/>
               </w:rPr>
-              <w:t>55</w:t>
-            </w:r>
-            <w:r>
-              <w:rPr>
-                <w:lang w:val="en"/>
-              </w:rPr>
-              <w:t xml:space="preserve"> to</w:t>
-            </w:r>
-          </w:p>
-          <w:p>
-            <w:pPr>
-              <w:rPr>
-                <w:lang w:val="en"/>
-              </w:rPr>
-            </w:pPr>
-            <w:r>
-              <w:rPr>
-                <w:lang w:val="en"/>
-              </w:rPr>
-              <w:t>65</w:t>
+              <w:t>100</w:t>
             </w:r>
           </w:p>
         </w:tc>
@@ -4221,13 +3957,7 @@
               <w:rPr>
                 <w:lang w:val="en"/>
               </w:rPr>
-              <w:t>Power Plan</w:t>
-            </w:r>
-            <w:r>
-              <w:rPr>
-                <w:lang w:val="en"/>
-              </w:rPr>
-              <w:t>t</w:t>
+              <w:t>Cerulean Cave</w:t>
             </w:r>
           </w:p>
         </w:tc>
@@ -4266,10 +3996,10 @@
                 <w:lang w:val="en"/>
               </w:rPr>
               <w:drawing>
-                <wp:inline distT="0" distB="0" distL="0" distR="0" wp14:anchorId="41AC5DB6" wp14:editId="70EA08CE">
+                <wp:inline distT="0" distB="0" distL="0" distR="0" wp14:anchorId="02A6CF0C" wp14:editId="3513BC61">
                   <wp:extent cx="695325" cy="695325"/>
-                  <wp:effectExtent l="0" t="0" r="9525" b="9525"/>
-                  <wp:docPr id="1156418530" name="Picture 52"/>
+                  <wp:effectExtent l="0" t="0" r="0" b="0"/>
+                  <wp:docPr id="179651746" name="Picture 54"/>
                   <wp:cNvGraphicFramePr>
                     <a:graphicFrameLocks xmlns:a="http://schemas.openxmlformats.org/drawingml/2006/main" noChangeAspect="1"/>
                   </wp:cNvGraphicFramePr>
@@ -4277,7 +4007,7 @@
                     <a:graphicData uri="http://schemas.openxmlformats.org/drawingml/2006/picture">
                       <pic:pic xmlns:pic="http://schemas.openxmlformats.org/drawingml/2006/picture">
                         <pic:nvPicPr>
-                          <pic:cNvPr id="0" name="image165.png"/>
+                          <pic:cNvPr id="0" name="image149.png"/>
                           <pic:cNvPicPr>
                             <a:picLocks noChangeAspect="1" noChangeArrowheads="1"/>
                           </pic:cNvPicPr>
@@ -4346,8 +4076,17 @@
                 <w:b/>
                 <w:lang w:val="en"/>
               </w:rPr>
-              <w:t>Zapdos</w:t>
-            </w:r>
+              <w:t xml:space="preserve"> </w:t>
+            </w:r>
+            <w:proofErr w:type="spellStart"/>
+            <w:r>
+              <w:rPr>
+                <w:b/>
+                <w:lang w:val="en"/>
+              </w:rPr>
+              <w:t>Voltorb</w:t>
+            </w:r>
+            <w:proofErr w:type="spellEnd"/>
           </w:p>
         </w:tc>
         <w:tc>
@@ -4378,7 +4117,13 @@
               <w:rPr>
                 <w:lang w:val="en"/>
               </w:rPr>
-              <w:t>100</w:t>
+              <w:t>5</w:t>
+            </w:r>
+            <w:r>
+              <w:rPr>
+                <w:lang w:val="en"/>
+              </w:rPr>
+              <w:t>3</w:t>
             </w:r>
           </w:p>
         </w:tc>
@@ -4410,7 +4155,7 @@
               <w:rPr>
                 <w:lang w:val="en"/>
               </w:rPr>
-              <w:t>Cerulean Cave</w:t>
+              <w:t>Power Plant</w:t>
             </w:r>
           </w:p>
         </w:tc>
@@ -4449,10 +4194,10 @@
                 <w:lang w:val="en"/>
               </w:rPr>
               <w:drawing>
-                <wp:inline distT="0" distB="0" distL="0" distR="0" wp14:anchorId="0C93EDAE" wp14:editId="2D2BB5B5">
+                <wp:inline distT="0" distB="0" distL="0" distR="0" wp14:anchorId="5461A965" wp14:editId="528CFB03">
                   <wp:extent cx="695325" cy="695325"/>
-                  <wp:effectExtent l="0" t="0" r="9525" b="9525"/>
-                  <wp:docPr id="30881698" name="Picture 51"/>
+                  <wp:effectExtent l="0" t="0" r="0" b="9525"/>
+                  <wp:docPr id="1119180194" name="Picture 53"/>
                   <wp:cNvGraphicFramePr>
                     <a:graphicFrameLocks xmlns:a="http://schemas.openxmlformats.org/drawingml/2006/main" noChangeAspect="1"/>
                   </wp:cNvGraphicFramePr>
@@ -4460,7 +4205,7 @@
                     <a:graphicData uri="http://schemas.openxmlformats.org/drawingml/2006/picture">
                       <pic:pic xmlns:pic="http://schemas.openxmlformats.org/drawingml/2006/picture">
                         <pic:nvPicPr>
-                          <pic:cNvPr id="0" name="image172.png"/>
+                          <pic:cNvPr id="0" name="image43.png"/>
                           <pic:cNvPicPr>
                             <a:picLocks noChangeAspect="1" noChangeArrowheads="1"/>
                           </pic:cNvPicPr>
@@ -4524,15 +4269,13 @@
                 <w:lang w:val="en"/>
               </w:rPr>
             </w:pPr>
-            <w:proofErr w:type="spellStart"/>
-            <w:r>
-              <w:rPr>
-                <w:b/>
-                <w:lang w:val="en"/>
-              </w:rPr>
-              <w:t>Moltres</w:t>
-            </w:r>
-            <w:proofErr w:type="spellEnd"/>
+            <w:r>
+              <w:rPr>
+                <w:b/>
+                <w:lang w:val="en"/>
+              </w:rPr>
+              <w:t>Electrode</w:t>
+            </w:r>
           </w:p>
         </w:tc>
         <w:tc>
@@ -4563,7 +4306,26 @@
               <w:rPr>
                 <w:lang w:val="en"/>
               </w:rPr>
-              <w:t>100</w:t>
+              <w:t>55</w:t>
+            </w:r>
+            <w:r>
+              <w:rPr>
+                <w:lang w:val="en"/>
+              </w:rPr>
+              <w:t xml:space="preserve"> to</w:t>
+            </w:r>
+          </w:p>
+          <w:p>
+            <w:pPr>
+              <w:rPr>
+                <w:lang w:val="en"/>
+              </w:rPr>
+            </w:pPr>
+            <w:r>
+              <w:rPr>
+                <w:lang w:val="en"/>
+              </w:rPr>
+              <w:t>65</w:t>
             </w:r>
           </w:p>
         </w:tc>
@@ -4595,7 +4357,13 @@
               <w:rPr>
                 <w:lang w:val="en"/>
               </w:rPr>
-              <w:t>Cerulean Cave</w:t>
+              <w:t>Power Plan</w:t>
+            </w:r>
+            <w:r>
+              <w:rPr>
+                <w:lang w:val="en"/>
+              </w:rPr>
+              <w:t>t</w:t>
             </w:r>
           </w:p>
         </w:tc>
@@ -4633,12 +4401,11 @@
                 <w:noProof/>
                 <w:lang w:val="en"/>
               </w:rPr>
-              <w:lastRenderedPageBreak/>
               <w:drawing>
-                <wp:inline distT="0" distB="0" distL="0" distR="0" wp14:anchorId="2211E888" wp14:editId="63DF503D">
-                  <wp:extent cx="533400" cy="533400"/>
-                  <wp:effectExtent l="0" t="0" r="0" b="0"/>
-                  <wp:docPr id="1070980771" name="Picture 50"/>
+                <wp:inline distT="0" distB="0" distL="0" distR="0" wp14:anchorId="41AC5DB6" wp14:editId="70EA08CE">
+                  <wp:extent cx="695325" cy="695325"/>
+                  <wp:effectExtent l="0" t="0" r="9525" b="9525"/>
+                  <wp:docPr id="1156418530" name="Picture 52"/>
                   <wp:cNvGraphicFramePr>
                     <a:graphicFrameLocks xmlns:a="http://schemas.openxmlformats.org/drawingml/2006/main" noChangeAspect="1"/>
                   </wp:cNvGraphicFramePr>
@@ -4646,7 +4413,7 @@
                     <a:graphicData uri="http://schemas.openxmlformats.org/drawingml/2006/picture">
                       <pic:pic xmlns:pic="http://schemas.openxmlformats.org/drawingml/2006/picture">
                         <pic:nvPicPr>
-                          <pic:cNvPr id="0" name="image75.png"/>
+                          <pic:cNvPr id="0" name="image165.png"/>
                           <pic:cNvPicPr>
                             <a:picLocks noChangeAspect="1" noChangeArrowheads="1"/>
                           </pic:cNvPicPr>
@@ -4667,7 +4434,7 @@
                         <pic:spPr bwMode="auto">
                           <a:xfrm>
                             <a:off x="0" y="0"/>
-                            <a:ext cx="533400" cy="533400"/>
+                            <a:ext cx="695325" cy="695325"/>
                           </a:xfrm>
                           <a:prstGeom prst="rect">
                             <a:avLst/>
@@ -4710,15 +4477,13 @@
                 <w:lang w:val="en"/>
               </w:rPr>
             </w:pPr>
-            <w:proofErr w:type="spellStart"/>
-            <w:r>
-              <w:rPr>
-                <w:b/>
-                <w:lang w:val="en"/>
-              </w:rPr>
-              <w:t>Mewtwo</w:t>
-            </w:r>
-            <w:proofErr w:type="spellEnd"/>
+            <w:r>
+              <w:rPr>
+                <w:b/>
+                <w:lang w:val="en"/>
+              </w:rPr>
+              <w:t>Zapdos</w:t>
+            </w:r>
           </w:p>
         </w:tc>
         <w:tc>
@@ -4749,13 +4514,7 @@
               <w:rPr>
                 <w:lang w:val="en"/>
               </w:rPr>
-              <w:t>10</w:t>
-            </w:r>
-            <w:r>
-              <w:rPr>
-                <w:lang w:val="en"/>
-              </w:rPr>
-              <w:t>0</w:t>
+              <w:t>100</w:t>
             </w:r>
           </w:p>
         </w:tc>
@@ -4789,13 +4548,6 @@
               </w:rPr>
               <w:t>Cerulean Cave</w:t>
             </w:r>
-          </w:p>
-          <w:p>
-            <w:pPr>
-              <w:rPr>
-                <w:lang w:val="en"/>
-              </w:rPr>
-            </w:pPr>
           </w:p>
         </w:tc>
       </w:tr>
@@ -4832,11 +4584,12 @@
                 <w:noProof/>
                 <w:lang w:val="en"/>
               </w:rPr>
+              <w:lastRenderedPageBreak/>
               <w:drawing>
-                <wp:inline distT="0" distB="0" distL="0" distR="0" wp14:anchorId="2412655A" wp14:editId="18352704">
+                <wp:inline distT="0" distB="0" distL="0" distR="0" wp14:anchorId="0C93EDAE" wp14:editId="2D2BB5B5">
                   <wp:extent cx="695325" cy="695325"/>
-                  <wp:effectExtent l="0" t="0" r="0" b="9525"/>
-                  <wp:docPr id="1736752609" name="Picture 49"/>
+                  <wp:effectExtent l="0" t="0" r="9525" b="9525"/>
+                  <wp:docPr id="30881698" name="Picture 51"/>
                   <wp:cNvGraphicFramePr>
                     <a:graphicFrameLocks xmlns:a="http://schemas.openxmlformats.org/drawingml/2006/main" noChangeAspect="1"/>
                   </wp:cNvGraphicFramePr>
@@ -4844,7 +4597,7 @@
                     <a:graphicData uri="http://schemas.openxmlformats.org/drawingml/2006/picture">
                       <pic:pic xmlns:pic="http://schemas.openxmlformats.org/drawingml/2006/picture">
                         <pic:nvPicPr>
-                          <pic:cNvPr id="0" name="image222.png"/>
+                          <pic:cNvPr id="0" name="image172.png"/>
                           <pic:cNvPicPr>
                             <a:picLocks noChangeAspect="1" noChangeArrowheads="1"/>
                           </pic:cNvPicPr>
@@ -4908,13 +4661,15 @@
                 <w:lang w:val="en"/>
               </w:rPr>
             </w:pPr>
-            <w:r>
-              <w:rPr>
-                <w:b/>
-                <w:lang w:val="en"/>
-              </w:rPr>
-              <w:t>Mew</w:t>
-            </w:r>
+            <w:proofErr w:type="spellStart"/>
+            <w:r>
+              <w:rPr>
+                <w:b/>
+                <w:lang w:val="en"/>
+              </w:rPr>
+              <w:t>Moltres</w:t>
+            </w:r>
+            <w:proofErr w:type="spellEnd"/>
           </w:p>
         </w:tc>
         <w:tc>
@@ -4995,373 +4750,7 @@
               <w:bottom w:val="single" w:sz="8" w:space="0" w:color="000000"/>
               <w:right w:val="single" w:sz="8" w:space="0" w:color="000000"/>
             </w:tcBorders>
-            <w:shd w:val="clear" w:color="auto" w:fill="EA9999"/>
-            <w:tcMar>
-              <w:top w:w="100" w:type="dxa"/>
-              <w:left w:w="100" w:type="dxa"/>
-              <w:bottom w:w="100" w:type="dxa"/>
-              <w:right w:w="100" w:type="dxa"/>
-            </w:tcMar>
-            <w:hideMark/>
-          </w:tcPr>
-          <w:p>
-            <w:pPr>
-              <w:rPr>
-                <w:lang w:val="en"/>
-              </w:rPr>
-            </w:pPr>
-            <w:r>
-              <w:object w:dxaOrig="1320" w:dyaOrig="1095" w14:anchorId="7B9B1783">
-                <v:shape id="_x0000_i1030" type="#_x0000_t75" style="width:58.5pt;height:48pt" o:ole="">
-                  <v:imagedata r:id="rId34" o:title=""/>
-                </v:shape>
-                <o:OLEObject Type="Embed" ProgID="PBrush" ShapeID="_x0000_i1030" DrawAspect="Content" ObjectID="_1832739332" r:id="rId35"/>
-              </w:object>
-            </w:r>
-          </w:p>
-        </w:tc>
-        <w:tc>
-          <w:tcPr>
-            <w:tcW w:w="2340" w:type="dxa"/>
-            <w:tcBorders>
-              <w:top w:val="single" w:sz="8" w:space="0" w:color="000000"/>
-              <w:left w:val="single" w:sz="8" w:space="0" w:color="000000"/>
-              <w:bottom w:val="single" w:sz="8" w:space="0" w:color="000000"/>
-              <w:right w:val="single" w:sz="8" w:space="0" w:color="000000"/>
-            </w:tcBorders>
-            <w:shd w:val="clear" w:color="auto" w:fill="EA9999"/>
-            <w:tcMar>
-              <w:top w:w="100" w:type="dxa"/>
-              <w:left w:w="100" w:type="dxa"/>
-              <w:bottom w:w="100" w:type="dxa"/>
-              <w:right w:w="100" w:type="dxa"/>
-            </w:tcMar>
-            <w:hideMark/>
-          </w:tcPr>
-          <w:p>
-            <w:pPr>
-              <w:rPr>
-                <w:b/>
-                <w:lang w:val="en"/>
-              </w:rPr>
-            </w:pPr>
-            <w:r>
-              <w:rPr>
-                <w:b/>
-                <w:lang w:val="en"/>
-              </w:rPr>
-              <w:t xml:space="preserve"> </w:t>
-            </w:r>
-            <w:proofErr w:type="spellStart"/>
-            <w:r>
-              <w:rPr>
-                <w:b/>
-                <w:lang w:val="en"/>
-              </w:rPr>
-              <w:t>Clefairy</w:t>
-            </w:r>
-            <w:proofErr w:type="spellEnd"/>
-          </w:p>
-        </w:tc>
-        <w:tc>
-          <w:tcPr>
-            <w:tcW w:w="1065" w:type="dxa"/>
-            <w:tcBorders>
-              <w:top w:val="single" w:sz="8" w:space="0" w:color="000000"/>
-              <w:left w:val="single" w:sz="8" w:space="0" w:color="000000"/>
-              <w:bottom w:val="single" w:sz="8" w:space="0" w:color="000000"/>
-              <w:right w:val="single" w:sz="8" w:space="0" w:color="000000"/>
-            </w:tcBorders>
-            <w:shd w:val="clear" w:color="auto" w:fill="EA9999"/>
-            <w:tcMar>
-              <w:top w:w="100" w:type="dxa"/>
-              <w:left w:w="100" w:type="dxa"/>
-              <w:bottom w:w="100" w:type="dxa"/>
-              <w:right w:w="100" w:type="dxa"/>
-            </w:tcMar>
-            <w:hideMark/>
-          </w:tcPr>
-          <w:p>
-            <w:pPr>
-              <w:rPr>
-                <w:lang w:val="en"/>
-              </w:rPr>
-            </w:pPr>
-            <w:r>
-              <w:rPr>
-                <w:lang w:val="en"/>
-              </w:rPr>
-              <w:t xml:space="preserve">Trade </w:t>
-            </w:r>
-            <w:proofErr w:type="spellStart"/>
-            <w:r>
-              <w:rPr>
-                <w:lang w:val="en"/>
-              </w:rPr>
-              <w:t>Lv</w:t>
-            </w:r>
-            <w:proofErr w:type="spellEnd"/>
-          </w:p>
-        </w:tc>
-        <w:tc>
-          <w:tcPr>
-            <w:tcW w:w="3495" w:type="dxa"/>
-            <w:tcBorders>
-              <w:top w:val="single" w:sz="8" w:space="0" w:color="000000"/>
-              <w:left w:val="single" w:sz="8" w:space="0" w:color="000000"/>
-              <w:bottom w:val="single" w:sz="8" w:space="0" w:color="000000"/>
-              <w:right w:val="single" w:sz="8" w:space="0" w:color="000000"/>
-            </w:tcBorders>
-            <w:shd w:val="clear" w:color="auto" w:fill="EA9999"/>
-            <w:tcMar>
-              <w:top w:w="100" w:type="dxa"/>
-              <w:left w:w="100" w:type="dxa"/>
-              <w:bottom w:w="100" w:type="dxa"/>
-              <w:right w:w="100" w:type="dxa"/>
-            </w:tcMar>
-            <w:hideMark/>
-          </w:tcPr>
-          <w:p>
-            <w:pPr>
-              <w:rPr>
-                <w:lang w:val="en"/>
-              </w:rPr>
-            </w:pPr>
-            <w:r>
-              <w:rPr>
-                <w:lang w:val="en"/>
-              </w:rPr>
-              <w:t>Route 2</w:t>
-            </w:r>
-          </w:p>
-          <w:p>
-            <w:pPr>
-              <w:rPr>
-                <w:lang w:val="en"/>
-              </w:rPr>
-            </w:pPr>
-            <w:r>
-              <w:rPr>
-                <w:lang w:val="en"/>
-              </w:rPr>
-              <w:t xml:space="preserve">(Requires </w:t>
-            </w:r>
-            <w:proofErr w:type="spellStart"/>
-            <w:r>
-              <w:rPr>
-                <w:lang w:val="en"/>
-              </w:rPr>
-              <w:t>Golbat</w:t>
-            </w:r>
-            <w:proofErr w:type="spellEnd"/>
-            <w:r>
-              <w:rPr>
-                <w:lang w:val="en"/>
-              </w:rPr>
-              <w:t>)</w:t>
-            </w:r>
-          </w:p>
-        </w:tc>
-      </w:tr>
-      <w:tr>
-        <w:trPr>
-          <w:jc w:val="center"/>
-        </w:trPr>
-        <w:tc>
-          <w:tcPr>
-            <w:tcW w:w="1365" w:type="dxa"/>
-            <w:tcBorders>
-              <w:top w:val="single" w:sz="8" w:space="0" w:color="000000"/>
-              <w:left w:val="single" w:sz="8" w:space="0" w:color="000000"/>
-              <w:bottom w:val="single" w:sz="8" w:space="0" w:color="000000"/>
-              <w:right w:val="single" w:sz="8" w:space="0" w:color="000000"/>
-            </w:tcBorders>
-            <w:shd w:val="clear" w:color="auto" w:fill="EA9999"/>
-            <w:tcMar>
-              <w:top w:w="100" w:type="dxa"/>
-              <w:left w:w="100" w:type="dxa"/>
-              <w:bottom w:w="100" w:type="dxa"/>
-              <w:right w:w="100" w:type="dxa"/>
-            </w:tcMar>
-            <w:hideMark/>
-          </w:tcPr>
-          <w:p>
-            <w:pPr>
-              <w:rPr>
-                <w:lang w:val="en"/>
-              </w:rPr>
-            </w:pPr>
-            <w:r>
-              <w:object w:dxaOrig="1185" w:dyaOrig="1110" w14:anchorId="1881CAF6">
-                <v:shape id="_x0000_i1031" type="#_x0000_t75" style="width:58.5pt;height:54.75pt" o:ole="">
-                  <v:imagedata r:id="rId36" o:title=""/>
-                </v:shape>
-                <o:OLEObject Type="Embed" ProgID="PBrush" ShapeID="_x0000_i1031" DrawAspect="Content" ObjectID="_1832739333" r:id="rId37"/>
-              </w:object>
-            </w:r>
-          </w:p>
-        </w:tc>
-        <w:tc>
-          <w:tcPr>
-            <w:tcW w:w="2340" w:type="dxa"/>
-            <w:tcBorders>
-              <w:top w:val="single" w:sz="8" w:space="0" w:color="000000"/>
-              <w:left w:val="single" w:sz="8" w:space="0" w:color="000000"/>
-              <w:bottom w:val="single" w:sz="8" w:space="0" w:color="000000"/>
-              <w:right w:val="single" w:sz="8" w:space="0" w:color="000000"/>
-            </w:tcBorders>
-            <w:shd w:val="clear" w:color="auto" w:fill="EA9999"/>
-            <w:tcMar>
-              <w:top w:w="100" w:type="dxa"/>
-              <w:left w:w="100" w:type="dxa"/>
-              <w:bottom w:w="100" w:type="dxa"/>
-              <w:right w:w="100" w:type="dxa"/>
-            </w:tcMar>
-            <w:hideMark/>
-          </w:tcPr>
-          <w:p>
-            <w:pPr>
-              <w:rPr>
-                <w:b/>
-                <w:lang w:val="en"/>
-              </w:rPr>
-            </w:pPr>
-            <w:r>
-              <w:rPr>
-                <w:b/>
-                <w:lang w:val="en"/>
-              </w:rPr>
-              <w:t xml:space="preserve"> </w:t>
-            </w:r>
-            <w:r>
-              <w:rPr>
-                <w:b/>
-                <w:lang w:val="en"/>
-              </w:rPr>
-              <w:t>Oddish</w:t>
-            </w:r>
-          </w:p>
-        </w:tc>
-        <w:tc>
-          <w:tcPr>
-            <w:tcW w:w="1065" w:type="dxa"/>
-            <w:tcBorders>
-              <w:top w:val="single" w:sz="8" w:space="0" w:color="000000"/>
-              <w:left w:val="single" w:sz="8" w:space="0" w:color="000000"/>
-              <w:bottom w:val="single" w:sz="8" w:space="0" w:color="000000"/>
-              <w:right w:val="single" w:sz="8" w:space="0" w:color="000000"/>
-            </w:tcBorders>
-            <w:shd w:val="clear" w:color="auto" w:fill="EA9999"/>
-            <w:tcMar>
-              <w:top w:w="100" w:type="dxa"/>
-              <w:left w:w="100" w:type="dxa"/>
-              <w:bottom w:w="100" w:type="dxa"/>
-              <w:right w:w="100" w:type="dxa"/>
-            </w:tcMar>
-            <w:hideMark/>
-          </w:tcPr>
-          <w:p>
-            <w:pPr>
-              <w:rPr>
-                <w:lang w:val="en"/>
-              </w:rPr>
-            </w:pPr>
-            <w:r>
-              <w:rPr>
-                <w:lang w:val="en"/>
-              </w:rPr>
-              <w:t xml:space="preserve">Trade </w:t>
-            </w:r>
-            <w:proofErr w:type="spellStart"/>
-            <w:r>
-              <w:rPr>
-                <w:lang w:val="en"/>
-              </w:rPr>
-              <w:t>Lv</w:t>
-            </w:r>
-            <w:proofErr w:type="spellEnd"/>
-          </w:p>
-        </w:tc>
-        <w:tc>
-          <w:tcPr>
-            <w:tcW w:w="3495" w:type="dxa"/>
-            <w:tcBorders>
-              <w:top w:val="single" w:sz="8" w:space="0" w:color="000000"/>
-              <w:left w:val="single" w:sz="8" w:space="0" w:color="000000"/>
-              <w:bottom w:val="single" w:sz="8" w:space="0" w:color="000000"/>
-              <w:right w:val="single" w:sz="8" w:space="0" w:color="000000"/>
-            </w:tcBorders>
-            <w:shd w:val="clear" w:color="auto" w:fill="EA9999"/>
-            <w:tcMar>
-              <w:top w:w="100" w:type="dxa"/>
-              <w:left w:w="100" w:type="dxa"/>
-              <w:bottom w:w="100" w:type="dxa"/>
-              <w:right w:w="100" w:type="dxa"/>
-            </w:tcMar>
-            <w:hideMark/>
-          </w:tcPr>
-          <w:p>
-            <w:pPr>
-              <w:rPr>
-                <w:lang w:val="en"/>
-              </w:rPr>
-            </w:pPr>
-            <w:r>
-              <w:rPr>
-                <w:lang w:val="en"/>
-              </w:rPr>
-              <w:t>Vermilion HM House</w:t>
-            </w:r>
-          </w:p>
-          <w:p>
-            <w:pPr>
-              <w:rPr>
-                <w:lang w:val="en"/>
-              </w:rPr>
-            </w:pPr>
-            <w:r>
-              <w:rPr>
-                <w:lang w:val="en"/>
-              </w:rPr>
-              <w:t xml:space="preserve">(Requires </w:t>
-            </w:r>
-            <w:proofErr w:type="spellStart"/>
-            <w:r>
-              <w:rPr>
-                <w:lang w:val="en"/>
-              </w:rPr>
-              <w:t>Nidoran_</w:t>
-            </w:r>
-            <w:r>
-              <w:rPr>
-                <w:lang w:val="en"/>
-              </w:rPr>
-              <w:t>M</w:t>
-            </w:r>
-            <w:proofErr w:type="spellEnd"/>
-            <w:r>
-              <w:rPr>
-                <w:lang w:val="en"/>
-              </w:rPr>
-              <w:t>)</w:t>
-            </w:r>
-          </w:p>
-        </w:tc>
-      </w:tr>
-      <w:tr>
-        <w:trPr>
-          <w:jc w:val="center"/>
-        </w:trPr>
-        <w:tc>
-          <w:tcPr>
-            <w:tcW w:w="1365" w:type="dxa"/>
-            <w:tcBorders>
-              <w:top w:val="single" w:sz="8" w:space="0" w:color="000000"/>
-              <w:left w:val="single" w:sz="8" w:space="0" w:color="000000"/>
-              <w:bottom w:val="single" w:sz="8" w:space="0" w:color="000000"/>
-              <w:right w:val="single" w:sz="8" w:space="0" w:color="000000"/>
-            </w:tcBorders>
-            <w:shd w:val="clear" w:color="auto" w:fill="EA9999"/>
+            <w:shd w:val="clear" w:color="auto" w:fill="A4C2F4"/>
             <w:tcMar>
               <w:top w:w="100" w:type="dxa"/>
               <w:left w:w="100" w:type="dxa"/>
@@ -5379,603 +4768,13 @@
             <w:r>
               <w:rPr>
                 <w:noProof/>
+                <w:lang w:val="en"/>
               </w:rPr>
               <w:drawing>
-                <wp:inline distT="0" distB="0" distL="0" distR="0" wp14:anchorId="588FA5BC" wp14:editId="19D60167">
-                  <wp:extent cx="739775" cy="739775"/>
-                  <wp:effectExtent l="0" t="0" r="0" b="3175"/>
-                  <wp:docPr id="155" name="image123.png"/>
-                  <wp:cNvGraphicFramePr/>
-                  <a:graphic xmlns:a="http://schemas.openxmlformats.org/drawingml/2006/main">
-                    <a:graphicData uri="http://schemas.openxmlformats.org/drawingml/2006/picture">
-                      <pic:pic xmlns:pic="http://schemas.openxmlformats.org/drawingml/2006/picture">
-                        <pic:nvPicPr>
-                          <pic:cNvPr id="155" name="image123.png"/>
-                          <pic:cNvPicPr/>
-                        </pic:nvPicPr>
-                        <pic:blipFill>
-                          <a:blip r:embed="rId38"/>
-                          <a:srcRect/>
-                          <a:stretch>
-                            <a:fillRect/>
-                          </a:stretch>
-                        </pic:blipFill>
-                        <pic:spPr>
-                          <a:xfrm>
-                            <a:off x="0" y="0"/>
-                            <a:ext cx="739775" cy="739775"/>
-                          </a:xfrm>
-                          <a:prstGeom prst="rect">
-                            <a:avLst/>
-                          </a:prstGeom>
-                          <a:ln/>
-                        </pic:spPr>
-                      </pic:pic>
-                    </a:graphicData>
-                  </a:graphic>
-                </wp:inline>
-              </w:drawing>
-            </w:r>
-          </w:p>
-        </w:tc>
-        <w:tc>
-          <w:tcPr>
-            <w:tcW w:w="2340" w:type="dxa"/>
-            <w:tcBorders>
-              <w:top w:val="single" w:sz="8" w:space="0" w:color="000000"/>
-              <w:left w:val="single" w:sz="8" w:space="0" w:color="000000"/>
-              <w:bottom w:val="single" w:sz="8" w:space="0" w:color="000000"/>
-              <w:right w:val="single" w:sz="8" w:space="0" w:color="000000"/>
-            </w:tcBorders>
-            <w:shd w:val="clear" w:color="auto" w:fill="EA9999"/>
-            <w:tcMar>
-              <w:top w:w="100" w:type="dxa"/>
-              <w:left w:w="100" w:type="dxa"/>
-              <w:bottom w:w="100" w:type="dxa"/>
-              <w:right w:w="100" w:type="dxa"/>
-            </w:tcMar>
-            <w:hideMark/>
-          </w:tcPr>
-          <w:p>
-            <w:pPr>
-              <w:rPr>
-                <w:b/>
-                <w:lang w:val="en"/>
-              </w:rPr>
-            </w:pPr>
-            <w:r>
-              <w:rPr>
-                <w:b/>
-                <w:lang w:val="en"/>
-              </w:rPr>
-              <w:t xml:space="preserve"> </w:t>
-            </w:r>
-            <w:proofErr w:type="spellStart"/>
-            <w:r>
-              <w:rPr>
-                <w:b/>
-                <w:lang w:val="en"/>
-              </w:rPr>
-              <w:t>Flareon</w:t>
-            </w:r>
-            <w:proofErr w:type="spellEnd"/>
-          </w:p>
-        </w:tc>
-        <w:tc>
-          <w:tcPr>
-            <w:tcW w:w="1065" w:type="dxa"/>
-            <w:tcBorders>
-              <w:top w:val="single" w:sz="8" w:space="0" w:color="000000"/>
-              <w:left w:val="single" w:sz="8" w:space="0" w:color="000000"/>
-              <w:bottom w:val="single" w:sz="8" w:space="0" w:color="000000"/>
-              <w:right w:val="single" w:sz="8" w:space="0" w:color="000000"/>
-            </w:tcBorders>
-            <w:shd w:val="clear" w:color="auto" w:fill="EA9999"/>
-            <w:tcMar>
-              <w:top w:w="100" w:type="dxa"/>
-              <w:left w:w="100" w:type="dxa"/>
-              <w:bottom w:w="100" w:type="dxa"/>
-              <w:right w:w="100" w:type="dxa"/>
-            </w:tcMar>
-            <w:hideMark/>
-          </w:tcPr>
-          <w:p>
-            <w:pPr>
-              <w:rPr>
-                <w:lang w:val="en"/>
-              </w:rPr>
-            </w:pPr>
-            <w:r>
-              <w:rPr>
-                <w:lang w:val="en"/>
-              </w:rPr>
-              <w:t xml:space="preserve">Trade </w:t>
-            </w:r>
-            <w:proofErr w:type="spellStart"/>
-            <w:r>
-              <w:rPr>
-                <w:lang w:val="en"/>
-              </w:rPr>
-              <w:t>Lv</w:t>
-            </w:r>
-            <w:proofErr w:type="spellEnd"/>
-          </w:p>
-        </w:tc>
-        <w:tc>
-          <w:tcPr>
-            <w:tcW w:w="3495" w:type="dxa"/>
-            <w:tcBorders>
-              <w:top w:val="single" w:sz="8" w:space="0" w:color="000000"/>
-              <w:left w:val="single" w:sz="8" w:space="0" w:color="000000"/>
-              <w:bottom w:val="single" w:sz="8" w:space="0" w:color="000000"/>
-              <w:right w:val="single" w:sz="8" w:space="0" w:color="000000"/>
-            </w:tcBorders>
-            <w:shd w:val="clear" w:color="auto" w:fill="EA9999"/>
-            <w:tcMar>
-              <w:top w:w="100" w:type="dxa"/>
-              <w:left w:w="100" w:type="dxa"/>
-              <w:bottom w:w="100" w:type="dxa"/>
-              <w:right w:w="100" w:type="dxa"/>
-            </w:tcMar>
-            <w:hideMark/>
-          </w:tcPr>
-          <w:p>
-            <w:pPr>
-              <w:rPr>
-                <w:lang w:val="en"/>
-              </w:rPr>
-            </w:pPr>
-            <w:r>
-              <w:rPr>
-                <w:lang w:val="en"/>
-              </w:rPr>
-              <w:t>Route 11</w:t>
-            </w:r>
-          </w:p>
-          <w:p>
-            <w:pPr>
-              <w:rPr>
-                <w:lang w:val="en"/>
-              </w:rPr>
-            </w:pPr>
-            <w:r>
-              <w:rPr>
-                <w:lang w:val="en"/>
-              </w:rPr>
-              <w:t xml:space="preserve">(Requires </w:t>
-            </w:r>
-            <w:proofErr w:type="spellStart"/>
-            <w:r>
-              <w:rPr>
-                <w:lang w:val="en"/>
-              </w:rPr>
-              <w:t>Farfetchd</w:t>
-            </w:r>
-            <w:proofErr w:type="spellEnd"/>
-            <w:r>
-              <w:rPr>
-                <w:lang w:val="en"/>
-              </w:rPr>
-              <w:t>)</w:t>
-            </w:r>
-          </w:p>
-        </w:tc>
-      </w:tr>
-      <w:tr>
-        <w:trPr>
-          <w:jc w:val="center"/>
-        </w:trPr>
-        <w:tc>
-          <w:tcPr>
-            <w:tcW w:w="1365" w:type="dxa"/>
-            <w:tcBorders>
-              <w:top w:val="single" w:sz="8" w:space="0" w:color="000000"/>
-              <w:left w:val="single" w:sz="8" w:space="0" w:color="000000"/>
-              <w:bottom w:val="single" w:sz="8" w:space="0" w:color="000000"/>
-              <w:right w:val="single" w:sz="8" w:space="0" w:color="000000"/>
-            </w:tcBorders>
-            <w:shd w:val="clear" w:color="auto" w:fill="EA9999"/>
-            <w:tcMar>
-              <w:top w:w="100" w:type="dxa"/>
-              <w:left w:w="100" w:type="dxa"/>
-              <w:bottom w:w="100" w:type="dxa"/>
-              <w:right w:w="100" w:type="dxa"/>
-            </w:tcMar>
-            <w:hideMark/>
-          </w:tcPr>
-          <w:p>
-            <w:pPr>
-              <w:rPr>
-                <w:lang w:val="en"/>
-              </w:rPr>
-            </w:pPr>
-            <w:r>
-              <w:object w:dxaOrig="1170" w:dyaOrig="1095" w14:anchorId="36EE6C08">
-                <v:shape id="_x0000_i1032" type="#_x0000_t75" style="width:58.5pt;height:54.75pt" o:ole="">
-                  <v:imagedata r:id="rId39" o:title=""/>
-                </v:shape>
-                <o:OLEObject Type="Embed" ProgID="PBrush" ShapeID="_x0000_i1032" DrawAspect="Content" ObjectID="_1832739334" r:id="rId40"/>
-              </w:object>
-            </w:r>
-          </w:p>
-        </w:tc>
-        <w:tc>
-          <w:tcPr>
-            <w:tcW w:w="2340" w:type="dxa"/>
-            <w:tcBorders>
-              <w:top w:val="single" w:sz="8" w:space="0" w:color="000000"/>
-              <w:left w:val="single" w:sz="8" w:space="0" w:color="000000"/>
-              <w:bottom w:val="single" w:sz="8" w:space="0" w:color="000000"/>
-              <w:right w:val="single" w:sz="8" w:space="0" w:color="000000"/>
-            </w:tcBorders>
-            <w:shd w:val="clear" w:color="auto" w:fill="EA9999"/>
-            <w:tcMar>
-              <w:top w:w="100" w:type="dxa"/>
-              <w:left w:w="100" w:type="dxa"/>
-              <w:bottom w:w="100" w:type="dxa"/>
-              <w:right w:w="100" w:type="dxa"/>
-            </w:tcMar>
-            <w:hideMark/>
-          </w:tcPr>
-          <w:p>
-            <w:pPr>
-              <w:rPr>
-                <w:b/>
-                <w:lang w:val="en"/>
-              </w:rPr>
-            </w:pPr>
-            <w:proofErr w:type="spellStart"/>
-            <w:r>
-              <w:rPr>
-                <w:b/>
-                <w:lang w:val="en"/>
-              </w:rPr>
-              <w:t>Tentacool</w:t>
-            </w:r>
-            <w:proofErr w:type="spellEnd"/>
-          </w:p>
-        </w:tc>
-        <w:tc>
-          <w:tcPr>
-            <w:tcW w:w="1065" w:type="dxa"/>
-            <w:tcBorders>
-              <w:top w:val="single" w:sz="8" w:space="0" w:color="000000"/>
-              <w:left w:val="single" w:sz="8" w:space="0" w:color="000000"/>
-              <w:bottom w:val="single" w:sz="8" w:space="0" w:color="000000"/>
-              <w:right w:val="single" w:sz="8" w:space="0" w:color="000000"/>
-            </w:tcBorders>
-            <w:shd w:val="clear" w:color="auto" w:fill="EA9999"/>
-            <w:tcMar>
-              <w:top w:w="100" w:type="dxa"/>
-              <w:left w:w="100" w:type="dxa"/>
-              <w:bottom w:w="100" w:type="dxa"/>
-              <w:right w:w="100" w:type="dxa"/>
-            </w:tcMar>
-            <w:hideMark/>
-          </w:tcPr>
-          <w:p>
-            <w:pPr>
-              <w:rPr>
-                <w:lang w:val="en"/>
-              </w:rPr>
-            </w:pPr>
-            <w:r>
-              <w:rPr>
-                <w:lang w:val="en"/>
-              </w:rPr>
-              <w:t xml:space="preserve">Trade </w:t>
-            </w:r>
-            <w:proofErr w:type="spellStart"/>
-            <w:r>
-              <w:rPr>
-                <w:lang w:val="en"/>
-              </w:rPr>
-              <w:t>Lv</w:t>
-            </w:r>
-            <w:proofErr w:type="spellEnd"/>
-          </w:p>
-        </w:tc>
-        <w:tc>
-          <w:tcPr>
-            <w:tcW w:w="3495" w:type="dxa"/>
-            <w:tcBorders>
-              <w:top w:val="single" w:sz="8" w:space="0" w:color="000000"/>
-              <w:left w:val="single" w:sz="8" w:space="0" w:color="000000"/>
-              <w:bottom w:val="single" w:sz="8" w:space="0" w:color="000000"/>
-              <w:right w:val="single" w:sz="8" w:space="0" w:color="000000"/>
-            </w:tcBorders>
-            <w:shd w:val="clear" w:color="auto" w:fill="EA9999"/>
-            <w:tcMar>
-              <w:top w:w="100" w:type="dxa"/>
-              <w:left w:w="100" w:type="dxa"/>
-              <w:bottom w:w="100" w:type="dxa"/>
-              <w:right w:w="100" w:type="dxa"/>
-            </w:tcMar>
-            <w:hideMark/>
-          </w:tcPr>
-          <w:p>
-            <w:pPr>
-              <w:rPr>
-                <w:lang w:val="en"/>
-              </w:rPr>
-            </w:pPr>
-            <w:r>
-              <w:rPr>
-                <w:lang w:val="en"/>
-              </w:rPr>
-              <w:t>Vermilion HM House</w:t>
-            </w:r>
-          </w:p>
-          <w:p>
-            <w:pPr>
-              <w:rPr>
-                <w:lang w:val="en"/>
-              </w:rPr>
-            </w:pPr>
-            <w:r>
-              <w:rPr>
-                <w:lang w:val="en"/>
-              </w:rPr>
-              <w:t>(Require</w:t>
-            </w:r>
-            <w:r>
-              <w:rPr>
-                <w:lang w:val="en"/>
-              </w:rPr>
-              <w:t>s</w:t>
-            </w:r>
-            <w:r>
-              <w:rPr>
-                <w:lang w:val="en"/>
-              </w:rPr>
-              <w:t xml:space="preserve"> </w:t>
-            </w:r>
-            <w:proofErr w:type="spellStart"/>
-            <w:r>
-              <w:rPr>
-                <w:lang w:val="en"/>
-              </w:rPr>
-              <w:t>Butterfree</w:t>
-            </w:r>
-            <w:proofErr w:type="spellEnd"/>
-            <w:r>
-              <w:rPr>
-                <w:lang w:val="en"/>
-              </w:rPr>
-              <w:t>)</w:t>
-            </w:r>
-          </w:p>
-        </w:tc>
-      </w:tr>
-      <w:tr>
-        <w:trPr>
-          <w:jc w:val="center"/>
-        </w:trPr>
-        <w:tc>
-          <w:tcPr>
-            <w:tcW w:w="1365" w:type="dxa"/>
-            <w:tcBorders>
-              <w:top w:val="single" w:sz="8" w:space="0" w:color="000000"/>
-              <w:left w:val="single" w:sz="8" w:space="0" w:color="000000"/>
-              <w:bottom w:val="single" w:sz="8" w:space="0" w:color="000000"/>
-              <w:right w:val="single" w:sz="8" w:space="0" w:color="000000"/>
-            </w:tcBorders>
-            <w:shd w:val="clear" w:color="auto" w:fill="EA9999"/>
-            <w:tcMar>
-              <w:top w:w="100" w:type="dxa"/>
-              <w:left w:w="100" w:type="dxa"/>
-              <w:bottom w:w="100" w:type="dxa"/>
-              <w:right w:w="100" w:type="dxa"/>
-            </w:tcMar>
-            <w:hideMark/>
-          </w:tcPr>
-          <w:p>
-            <w:pPr>
-              <w:rPr>
-                <w:lang w:val="en"/>
-              </w:rPr>
-            </w:pPr>
-            <w:r>
-              <w:object w:dxaOrig="1305" w:dyaOrig="1185" w14:anchorId="4E137F21">
-                <v:shape id="_x0000_i1033" type="#_x0000_t75" style="width:58.5pt;height:52.5pt" o:ole="">
-                  <v:imagedata r:id="rId41" o:title=""/>
-                </v:shape>
-                <o:OLEObject Type="Embed" ProgID="PBrush" ShapeID="_x0000_i1033" DrawAspect="Content" ObjectID="_1832739335" r:id="rId42"/>
-              </w:object>
-            </w:r>
-          </w:p>
-        </w:tc>
-        <w:tc>
-          <w:tcPr>
-            <w:tcW w:w="2340" w:type="dxa"/>
-            <w:tcBorders>
-              <w:top w:val="single" w:sz="8" w:space="0" w:color="000000"/>
-              <w:left w:val="single" w:sz="8" w:space="0" w:color="000000"/>
-              <w:bottom w:val="single" w:sz="8" w:space="0" w:color="000000"/>
-              <w:right w:val="single" w:sz="8" w:space="0" w:color="000000"/>
-            </w:tcBorders>
-            <w:shd w:val="clear" w:color="auto" w:fill="EA9999"/>
-            <w:tcMar>
-              <w:top w:w="100" w:type="dxa"/>
-              <w:left w:w="100" w:type="dxa"/>
-              <w:bottom w:w="100" w:type="dxa"/>
-              <w:right w:w="100" w:type="dxa"/>
-            </w:tcMar>
-            <w:hideMark/>
-          </w:tcPr>
-          <w:p>
-            <w:pPr>
-              <w:rPr>
-                <w:b/>
-                <w:lang w:val="en"/>
-              </w:rPr>
-            </w:pPr>
-            <w:proofErr w:type="spellStart"/>
-            <w:r>
-              <w:rPr>
-                <w:b/>
-                <w:lang w:val="en"/>
-              </w:rPr>
-              <w:t>P</w:t>
-            </w:r>
-            <w:r>
-              <w:rPr>
-                <w:b/>
-                <w:lang w:val="en"/>
-              </w:rPr>
-              <w:t>insir</w:t>
-            </w:r>
-            <w:proofErr w:type="spellEnd"/>
-          </w:p>
-        </w:tc>
-        <w:tc>
-          <w:tcPr>
-            <w:tcW w:w="1065" w:type="dxa"/>
-            <w:tcBorders>
-              <w:top w:val="single" w:sz="8" w:space="0" w:color="000000"/>
-              <w:left w:val="single" w:sz="8" w:space="0" w:color="000000"/>
-              <w:bottom w:val="single" w:sz="8" w:space="0" w:color="000000"/>
-              <w:right w:val="single" w:sz="8" w:space="0" w:color="000000"/>
-            </w:tcBorders>
-            <w:shd w:val="clear" w:color="auto" w:fill="EA9999"/>
-            <w:tcMar>
-              <w:top w:w="100" w:type="dxa"/>
-              <w:left w:w="100" w:type="dxa"/>
-              <w:bottom w:w="100" w:type="dxa"/>
-              <w:right w:w="100" w:type="dxa"/>
-            </w:tcMar>
-            <w:hideMark/>
-          </w:tcPr>
-          <w:p>
-            <w:pPr>
-              <w:rPr>
-                <w:lang w:val="en"/>
-              </w:rPr>
-            </w:pPr>
-            <w:r>
-              <w:rPr>
-                <w:lang w:val="en"/>
-              </w:rPr>
-              <w:t xml:space="preserve">Trade </w:t>
-            </w:r>
-            <w:proofErr w:type="spellStart"/>
-            <w:r>
-              <w:rPr>
-                <w:lang w:val="en"/>
-              </w:rPr>
-              <w:t>Lv</w:t>
-            </w:r>
-            <w:proofErr w:type="spellEnd"/>
-          </w:p>
-        </w:tc>
-        <w:tc>
-          <w:tcPr>
-            <w:tcW w:w="3495" w:type="dxa"/>
-            <w:tcBorders>
-              <w:top w:val="single" w:sz="8" w:space="0" w:color="000000"/>
-              <w:left w:val="single" w:sz="8" w:space="0" w:color="000000"/>
-              <w:bottom w:val="single" w:sz="8" w:space="0" w:color="000000"/>
-              <w:right w:val="single" w:sz="8" w:space="0" w:color="000000"/>
-            </w:tcBorders>
-            <w:shd w:val="clear" w:color="auto" w:fill="EA9999"/>
-            <w:tcMar>
-              <w:top w:w="100" w:type="dxa"/>
-              <w:left w:w="100" w:type="dxa"/>
-              <w:bottom w:w="100" w:type="dxa"/>
-              <w:right w:w="100" w:type="dxa"/>
-            </w:tcMar>
-            <w:hideMark/>
-          </w:tcPr>
-          <w:p>
-            <w:pPr>
-              <w:rPr>
-                <w:lang w:val="en"/>
-              </w:rPr>
-            </w:pPr>
-            <w:r>
-              <w:rPr>
-                <w:lang w:val="en"/>
-              </w:rPr>
-              <w:t>Route 18</w:t>
-            </w:r>
-          </w:p>
-          <w:p>
-            <w:pPr>
-              <w:rPr>
-                <w:lang w:val="en"/>
-              </w:rPr>
-            </w:pPr>
-            <w:r>
-              <w:rPr>
-                <w:lang w:val="en"/>
-              </w:rPr>
-              <w:t>(Require</w:t>
-            </w:r>
-            <w:r>
-              <w:rPr>
-                <w:lang w:val="en"/>
-              </w:rPr>
-              <w:t>s</w:t>
-            </w:r>
-            <w:r>
-              <w:rPr>
-                <w:lang w:val="en"/>
-              </w:rPr>
-              <w:t xml:space="preserve"> </w:t>
-            </w:r>
-            <w:r>
-              <w:rPr>
-                <w:lang w:val="en"/>
-              </w:rPr>
-              <w:t>Chansey</w:t>
-            </w:r>
-            <w:r>
-              <w:rPr>
-                <w:lang w:val="en"/>
-              </w:rPr>
-              <w:t>)</w:t>
-            </w:r>
-          </w:p>
-        </w:tc>
-      </w:tr>
-      <w:tr>
-        <w:trPr>
-          <w:jc w:val="center"/>
-        </w:trPr>
-        <w:tc>
-          <w:tcPr>
-            <w:tcW w:w="1365" w:type="dxa"/>
-            <w:tcBorders>
-              <w:top w:val="single" w:sz="8" w:space="0" w:color="000000"/>
-              <w:left w:val="single" w:sz="8" w:space="0" w:color="000000"/>
-              <w:bottom w:val="single" w:sz="8" w:space="0" w:color="000000"/>
-              <w:right w:val="single" w:sz="8" w:space="0" w:color="000000"/>
-            </w:tcBorders>
-            <w:shd w:val="clear" w:color="auto" w:fill="EA9999"/>
-            <w:tcMar>
-              <w:top w:w="100" w:type="dxa"/>
-              <w:left w:w="100" w:type="dxa"/>
-              <w:bottom w:w="100" w:type="dxa"/>
-              <w:right w:w="100" w:type="dxa"/>
-            </w:tcMar>
-            <w:hideMark/>
-          </w:tcPr>
-          <w:p>
-            <w:pPr>
-              <w:rPr>
-                <w:lang w:val="en"/>
-              </w:rPr>
-            </w:pPr>
-            <w:r>
-              <w:rPr>
-                <w:noProof/>
-                <w:lang w:val="en"/>
-              </w:rPr>
-              <w:drawing>
-                <wp:inline distT="0" distB="0" distL="0" distR="0" wp14:anchorId="4B0FBF66" wp14:editId="362E987A">
-                  <wp:extent cx="695325" cy="695325"/>
-                  <wp:effectExtent l="0" t="0" r="0" b="9525"/>
-                  <wp:docPr id="714347525" name="Picture 36"/>
+                <wp:inline distT="0" distB="0" distL="0" distR="0" wp14:anchorId="2211E888" wp14:editId="63DF503D">
+                  <wp:extent cx="533400" cy="533400"/>
+                  <wp:effectExtent l="0" t="0" r="0" b="0"/>
+                  <wp:docPr id="1070980771" name="Picture 50"/>
                   <wp:cNvGraphicFramePr>
                     <a:graphicFrameLocks xmlns:a="http://schemas.openxmlformats.org/drawingml/2006/main" noChangeAspect="1"/>
                   </wp:cNvGraphicFramePr>
@@ -5983,13 +4782,211 @@
                     <a:graphicData uri="http://schemas.openxmlformats.org/drawingml/2006/picture">
                       <pic:pic xmlns:pic="http://schemas.openxmlformats.org/drawingml/2006/picture">
                         <pic:nvPicPr>
-                          <pic:cNvPr id="0" name="image246.png"/>
+                          <pic:cNvPr id="0" name="image75.png"/>
                           <pic:cNvPicPr>
                             <a:picLocks noChangeAspect="1" noChangeArrowheads="1"/>
                           </pic:cNvPicPr>
                         </pic:nvPicPr>
                         <pic:blipFill>
-                          <a:blip r:embed="rId43">
+                          <a:blip r:embed="rId34">
+                            <a:extLst>
+                              <a:ext uri="{28A0092B-C50C-407E-A947-70E740481C1C}">
+                                <a14:useLocalDpi xmlns:a14="http://schemas.microsoft.com/office/drawing/2010/main" val="0"/>
+                              </a:ext>
+                            </a:extLst>
+                          </a:blip>
+                          <a:srcRect/>
+                          <a:stretch>
+                            <a:fillRect/>
+                          </a:stretch>
+                        </pic:blipFill>
+                        <pic:spPr bwMode="auto">
+                          <a:xfrm>
+                            <a:off x="0" y="0"/>
+                            <a:ext cx="533400" cy="533400"/>
+                          </a:xfrm>
+                          <a:prstGeom prst="rect">
+                            <a:avLst/>
+                          </a:prstGeom>
+                          <a:noFill/>
+                          <a:ln>
+                            <a:noFill/>
+                          </a:ln>
+                        </pic:spPr>
+                      </pic:pic>
+                    </a:graphicData>
+                  </a:graphic>
+                </wp:inline>
+              </w:drawing>
+            </w:r>
+          </w:p>
+        </w:tc>
+        <w:tc>
+          <w:tcPr>
+            <w:tcW w:w="2340" w:type="dxa"/>
+            <w:tcBorders>
+              <w:top w:val="single" w:sz="8" w:space="0" w:color="000000"/>
+              <w:left w:val="single" w:sz="8" w:space="0" w:color="000000"/>
+              <w:bottom w:val="single" w:sz="8" w:space="0" w:color="000000"/>
+              <w:right w:val="single" w:sz="8" w:space="0" w:color="000000"/>
+            </w:tcBorders>
+            <w:shd w:val="clear" w:color="auto" w:fill="A4C2F4"/>
+            <w:tcMar>
+              <w:top w:w="100" w:type="dxa"/>
+              <w:left w:w="100" w:type="dxa"/>
+              <w:bottom w:w="100" w:type="dxa"/>
+              <w:right w:w="100" w:type="dxa"/>
+            </w:tcMar>
+            <w:hideMark/>
+          </w:tcPr>
+          <w:p>
+            <w:pPr>
+              <w:rPr>
+                <w:b/>
+                <w:lang w:val="en"/>
+              </w:rPr>
+            </w:pPr>
+            <w:proofErr w:type="spellStart"/>
+            <w:r>
+              <w:rPr>
+                <w:b/>
+                <w:lang w:val="en"/>
+              </w:rPr>
+              <w:t>Mewtwo</w:t>
+            </w:r>
+            <w:proofErr w:type="spellEnd"/>
+          </w:p>
+        </w:tc>
+        <w:tc>
+          <w:tcPr>
+            <w:tcW w:w="1065" w:type="dxa"/>
+            <w:tcBorders>
+              <w:top w:val="single" w:sz="8" w:space="0" w:color="000000"/>
+              <w:left w:val="single" w:sz="8" w:space="0" w:color="000000"/>
+              <w:bottom w:val="single" w:sz="8" w:space="0" w:color="000000"/>
+              <w:right w:val="single" w:sz="8" w:space="0" w:color="000000"/>
+            </w:tcBorders>
+            <w:shd w:val="clear" w:color="auto" w:fill="A4C2F4"/>
+            <w:tcMar>
+              <w:top w:w="100" w:type="dxa"/>
+              <w:left w:w="100" w:type="dxa"/>
+              <w:bottom w:w="100" w:type="dxa"/>
+              <w:right w:w="100" w:type="dxa"/>
+            </w:tcMar>
+            <w:hideMark/>
+          </w:tcPr>
+          <w:p>
+            <w:pPr>
+              <w:rPr>
+                <w:lang w:val="en"/>
+              </w:rPr>
+            </w:pPr>
+            <w:r>
+              <w:rPr>
+                <w:lang w:val="en"/>
+              </w:rPr>
+              <w:t>10</w:t>
+            </w:r>
+            <w:r>
+              <w:rPr>
+                <w:lang w:val="en"/>
+              </w:rPr>
+              <w:t>0</w:t>
+            </w:r>
+          </w:p>
+        </w:tc>
+        <w:tc>
+          <w:tcPr>
+            <w:tcW w:w="3495" w:type="dxa"/>
+            <w:tcBorders>
+              <w:top w:val="single" w:sz="8" w:space="0" w:color="000000"/>
+              <w:left w:val="single" w:sz="8" w:space="0" w:color="000000"/>
+              <w:bottom w:val="single" w:sz="8" w:space="0" w:color="000000"/>
+              <w:right w:val="single" w:sz="8" w:space="0" w:color="000000"/>
+            </w:tcBorders>
+            <w:shd w:val="clear" w:color="auto" w:fill="A4C2F4"/>
+            <w:tcMar>
+              <w:top w:w="100" w:type="dxa"/>
+              <w:left w:w="100" w:type="dxa"/>
+              <w:bottom w:w="100" w:type="dxa"/>
+              <w:right w:w="100" w:type="dxa"/>
+            </w:tcMar>
+            <w:hideMark/>
+          </w:tcPr>
+          <w:p>
+            <w:pPr>
+              <w:rPr>
+                <w:lang w:val="en"/>
+              </w:rPr>
+            </w:pPr>
+            <w:r>
+              <w:rPr>
+                <w:lang w:val="en"/>
+              </w:rPr>
+              <w:t>Cerulean Cave</w:t>
+            </w:r>
+          </w:p>
+          <w:p>
+            <w:pPr>
+              <w:rPr>
+                <w:lang w:val="en"/>
+              </w:rPr>
+            </w:pPr>
+          </w:p>
+        </w:tc>
+      </w:tr>
+      <w:tr>
+        <w:trPr>
+          <w:jc w:val="center"/>
+        </w:trPr>
+        <w:tc>
+          <w:tcPr>
+            <w:tcW w:w="1365" w:type="dxa"/>
+            <w:tcBorders>
+              <w:top w:val="single" w:sz="8" w:space="0" w:color="000000"/>
+              <w:left w:val="single" w:sz="8" w:space="0" w:color="000000"/>
+              <w:bottom w:val="single" w:sz="8" w:space="0" w:color="000000"/>
+              <w:right w:val="single" w:sz="8" w:space="0" w:color="000000"/>
+            </w:tcBorders>
+            <w:shd w:val="clear" w:color="auto" w:fill="A4C2F4"/>
+            <w:tcMar>
+              <w:top w:w="100" w:type="dxa"/>
+              <w:left w:w="100" w:type="dxa"/>
+              <w:bottom w:w="100" w:type="dxa"/>
+              <w:right w:w="100" w:type="dxa"/>
+            </w:tcMar>
+            <w:hideMark/>
+          </w:tcPr>
+          <w:p>
+            <w:pPr>
+              <w:rPr>
+                <w:lang w:val="en"/>
+              </w:rPr>
+            </w:pPr>
+            <w:r>
+              <w:rPr>
+                <w:noProof/>
+                <w:lang w:val="en"/>
+              </w:rPr>
+              <w:drawing>
+                <wp:inline distT="0" distB="0" distL="0" distR="0" wp14:anchorId="2412655A" wp14:editId="18352704">
+                  <wp:extent cx="695325" cy="695325"/>
+                  <wp:effectExtent l="0" t="0" r="0" b="9525"/>
+                  <wp:docPr id="1736752609" name="Picture 49"/>
+                  <wp:cNvGraphicFramePr>
+                    <a:graphicFrameLocks xmlns:a="http://schemas.openxmlformats.org/drawingml/2006/main" noChangeAspect="1"/>
+                  </wp:cNvGraphicFramePr>
+                  <a:graphic xmlns:a="http://schemas.openxmlformats.org/drawingml/2006/main">
+                    <a:graphicData uri="http://schemas.openxmlformats.org/drawingml/2006/picture">
+                      <pic:pic xmlns:pic="http://schemas.openxmlformats.org/drawingml/2006/picture">
+                        <pic:nvPicPr>
+                          <pic:cNvPr id="0" name="image222.png"/>
+                          <pic:cNvPicPr>
+                            <a:picLocks noChangeAspect="1" noChangeArrowheads="1"/>
+                          </pic:cNvPicPr>
+                        </pic:nvPicPr>
+                        <pic:blipFill>
+                          <a:blip r:embed="rId35">
                             <a:extLst>
                               <a:ext uri="{28A0092B-C50C-407E-A947-70E740481C1C}">
                                 <a14:useLocalDpi xmlns:a14="http://schemas.microsoft.com/office/drawing/2010/main" val="0"/>
@@ -6031,31 +5028,29 @@
               <w:bottom w:val="single" w:sz="8" w:space="0" w:color="000000"/>
               <w:right w:val="single" w:sz="8" w:space="0" w:color="000000"/>
             </w:tcBorders>
-            <w:shd w:val="clear" w:color="auto" w:fill="EA9999"/>
-            <w:tcMar>
-              <w:top w:w="100" w:type="dxa"/>
-              <w:left w:w="100" w:type="dxa"/>
-              <w:bottom w:w="100" w:type="dxa"/>
-              <w:right w:w="100" w:type="dxa"/>
-            </w:tcMar>
-            <w:hideMark/>
-          </w:tcPr>
-          <w:p>
-            <w:pPr>
-              <w:rPr>
-                <w:b/>
-                <w:lang w:val="en"/>
-              </w:rPr>
-            </w:pPr>
-            <w:proofErr w:type="spellStart"/>
-            <w:r>
-              <w:rPr>
-                <w:b/>
-                <w:lang w:val="en"/>
-              </w:rPr>
-              <w:t>Dratini</w:t>
-            </w:r>
-            <w:proofErr w:type="spellEnd"/>
+            <w:shd w:val="clear" w:color="auto" w:fill="A4C2F4"/>
+            <w:tcMar>
+              <w:top w:w="100" w:type="dxa"/>
+              <w:left w:w="100" w:type="dxa"/>
+              <w:bottom w:w="100" w:type="dxa"/>
+              <w:right w:w="100" w:type="dxa"/>
+            </w:tcMar>
+            <w:hideMark/>
+          </w:tcPr>
+          <w:p>
+            <w:pPr>
+              <w:rPr>
+                <w:b/>
+                <w:lang w:val="en"/>
+              </w:rPr>
+            </w:pPr>
+            <w:r>
+              <w:rPr>
+                <w:b/>
+                <w:lang w:val="en"/>
+              </w:rPr>
+              <w:t>Mew</w:t>
+            </w:r>
           </w:p>
         </w:tc>
         <w:tc>
@@ -6067,35 +5062,27 @@
               <w:bottom w:val="single" w:sz="8" w:space="0" w:color="000000"/>
               <w:right w:val="single" w:sz="8" w:space="0" w:color="000000"/>
             </w:tcBorders>
-            <w:shd w:val="clear" w:color="auto" w:fill="EA9999"/>
-            <w:tcMar>
-              <w:top w:w="100" w:type="dxa"/>
-              <w:left w:w="100" w:type="dxa"/>
-              <w:bottom w:w="100" w:type="dxa"/>
-              <w:right w:w="100" w:type="dxa"/>
-            </w:tcMar>
-            <w:hideMark/>
-          </w:tcPr>
-          <w:p>
-            <w:pPr>
-              <w:rPr>
-                <w:lang w:val="en"/>
-              </w:rPr>
-            </w:pPr>
-            <w:r>
-              <w:rPr>
-                <w:lang w:val="en"/>
-              </w:rPr>
-              <w:t xml:space="preserve">Trade </w:t>
-            </w:r>
-            <w:proofErr w:type="spellStart"/>
-            <w:r>
-              <w:rPr>
-                <w:lang w:val="en"/>
-              </w:rPr>
-              <w:t>Lv</w:t>
-            </w:r>
-            <w:proofErr w:type="spellEnd"/>
+            <w:shd w:val="clear" w:color="auto" w:fill="A4C2F4"/>
+            <w:tcMar>
+              <w:top w:w="100" w:type="dxa"/>
+              <w:left w:w="100" w:type="dxa"/>
+              <w:bottom w:w="100" w:type="dxa"/>
+              <w:right w:w="100" w:type="dxa"/>
+            </w:tcMar>
+            <w:hideMark/>
+          </w:tcPr>
+          <w:p>
+            <w:pPr>
+              <w:rPr>
+                <w:lang w:val="en"/>
+              </w:rPr>
+            </w:pPr>
+            <w:r>
+              <w:rPr>
+                <w:lang w:val="en"/>
+              </w:rPr>
+              <w:t>100</w:t>
+            </w:r>
           </w:p>
         </w:tc>
         <w:tc>
@@ -6107,71 +5094,26 @@
               <w:bottom w:val="single" w:sz="8" w:space="0" w:color="000000"/>
               <w:right w:val="single" w:sz="8" w:space="0" w:color="000000"/>
             </w:tcBorders>
-            <w:shd w:val="clear" w:color="auto" w:fill="EA9999"/>
-            <w:tcMar>
-              <w:top w:w="100" w:type="dxa"/>
-              <w:left w:w="100" w:type="dxa"/>
-              <w:bottom w:w="100" w:type="dxa"/>
-              <w:right w:w="100" w:type="dxa"/>
-            </w:tcMar>
-            <w:hideMark/>
-          </w:tcPr>
-          <w:p>
-            <w:pPr>
-              <w:rPr>
-                <w:lang w:val="en"/>
-              </w:rPr>
-            </w:pPr>
-            <w:r>
-              <w:rPr>
-                <w:lang w:val="en"/>
-              </w:rPr>
-              <w:t>Cinnabar Island</w:t>
-            </w:r>
-            <w:r>
-              <w:rPr>
-                <w:lang w:val="en"/>
-              </w:rPr>
-              <w:t xml:space="preserve"> Lab</w:t>
-            </w:r>
-          </w:p>
-          <w:p>
-            <w:pPr>
-              <w:rPr>
-                <w:lang w:val="en"/>
-              </w:rPr>
-            </w:pPr>
-            <w:r>
-              <w:rPr>
-                <w:lang w:val="en"/>
-              </w:rPr>
-              <w:t>(Require</w:t>
-            </w:r>
-            <w:r>
-              <w:rPr>
-                <w:lang w:val="en"/>
-              </w:rPr>
-              <w:t>s</w:t>
-            </w:r>
-            <w:r>
-              <w:rPr>
-                <w:lang w:val="en"/>
-              </w:rPr>
-              <w:t xml:space="preserve"> </w:t>
-            </w:r>
-            <w:proofErr w:type="spellStart"/>
-            <w:r>
-              <w:rPr>
-                <w:lang w:val="en"/>
-              </w:rPr>
-              <w:t>Staryu</w:t>
-            </w:r>
-            <w:proofErr w:type="spellEnd"/>
-            <w:r>
-              <w:rPr>
-                <w:lang w:val="en"/>
-              </w:rPr>
-              <w:t>)</w:t>
+            <w:shd w:val="clear" w:color="auto" w:fill="A4C2F4"/>
+            <w:tcMar>
+              <w:top w:w="100" w:type="dxa"/>
+              <w:left w:w="100" w:type="dxa"/>
+              <w:bottom w:w="100" w:type="dxa"/>
+              <w:right w:w="100" w:type="dxa"/>
+            </w:tcMar>
+            <w:hideMark/>
+          </w:tcPr>
+          <w:p>
+            <w:pPr>
+              <w:rPr>
+                <w:lang w:val="en"/>
+              </w:rPr>
+            </w:pPr>
+            <w:r>
+              <w:rPr>
+                <w:lang w:val="en"/>
+              </w:rPr>
+              <w:t>Cerulean Cave</w:t>
             </w:r>
           </w:p>
         </w:tc>
@@ -6205,25 +5147,390 @@
               </w:rPr>
             </w:pPr>
             <w:r>
+              <w:object w:dxaOrig="1320" w:dyaOrig="1095" w14:anchorId="7B9B1783">
+                <v:shape id="_x0000_i1030" type="#_x0000_t75" style="width:58.1pt;height:47.7pt" o:ole="">
+                  <v:imagedata r:id="rId36" o:title=""/>
+                </v:shape>
+                <o:OLEObject Type="Embed" ProgID="PBrush" ShapeID="_x0000_i1030" DrawAspect="Content" ObjectID="_1833353772" r:id="rId37"/>
+              </w:object>
+            </w:r>
+          </w:p>
+        </w:tc>
+        <w:tc>
+          <w:tcPr>
+            <w:tcW w:w="2340" w:type="dxa"/>
+            <w:tcBorders>
+              <w:top w:val="single" w:sz="8" w:space="0" w:color="000000"/>
+              <w:left w:val="single" w:sz="8" w:space="0" w:color="000000"/>
+              <w:bottom w:val="single" w:sz="8" w:space="0" w:color="000000"/>
+              <w:right w:val="single" w:sz="8" w:space="0" w:color="000000"/>
+            </w:tcBorders>
+            <w:shd w:val="clear" w:color="auto" w:fill="EA9999"/>
+            <w:tcMar>
+              <w:top w:w="100" w:type="dxa"/>
+              <w:left w:w="100" w:type="dxa"/>
+              <w:bottom w:w="100" w:type="dxa"/>
+              <w:right w:w="100" w:type="dxa"/>
+            </w:tcMar>
+            <w:hideMark/>
+          </w:tcPr>
+          <w:p>
+            <w:pPr>
+              <w:rPr>
+                <w:b/>
+                <w:lang w:val="en"/>
+              </w:rPr>
+            </w:pPr>
+            <w:r>
+              <w:rPr>
+                <w:b/>
+                <w:lang w:val="en"/>
+              </w:rPr>
+              <w:t xml:space="preserve"> </w:t>
+            </w:r>
+            <w:proofErr w:type="spellStart"/>
+            <w:r>
+              <w:rPr>
+                <w:b/>
+                <w:lang w:val="en"/>
+              </w:rPr>
+              <w:t>Clefairy</w:t>
+            </w:r>
+            <w:proofErr w:type="spellEnd"/>
+          </w:p>
+        </w:tc>
+        <w:tc>
+          <w:tcPr>
+            <w:tcW w:w="1065" w:type="dxa"/>
+            <w:tcBorders>
+              <w:top w:val="single" w:sz="8" w:space="0" w:color="000000"/>
+              <w:left w:val="single" w:sz="8" w:space="0" w:color="000000"/>
+              <w:bottom w:val="single" w:sz="8" w:space="0" w:color="000000"/>
+              <w:right w:val="single" w:sz="8" w:space="0" w:color="000000"/>
+            </w:tcBorders>
+            <w:shd w:val="clear" w:color="auto" w:fill="EA9999"/>
+            <w:tcMar>
+              <w:top w:w="100" w:type="dxa"/>
+              <w:left w:w="100" w:type="dxa"/>
+              <w:bottom w:w="100" w:type="dxa"/>
+              <w:right w:w="100" w:type="dxa"/>
+            </w:tcMar>
+            <w:hideMark/>
+          </w:tcPr>
+          <w:p>
+            <w:pPr>
+              <w:rPr>
+                <w:lang w:val="en"/>
+              </w:rPr>
+            </w:pPr>
+            <w:r>
+              <w:rPr>
+                <w:lang w:val="en"/>
+              </w:rPr>
+              <w:t xml:space="preserve">Trade </w:t>
+            </w:r>
+            <w:proofErr w:type="spellStart"/>
+            <w:r>
+              <w:rPr>
+                <w:lang w:val="en"/>
+              </w:rPr>
+              <w:t>Lv</w:t>
+            </w:r>
+            <w:proofErr w:type="spellEnd"/>
+          </w:p>
+        </w:tc>
+        <w:tc>
+          <w:tcPr>
+            <w:tcW w:w="3495" w:type="dxa"/>
+            <w:tcBorders>
+              <w:top w:val="single" w:sz="8" w:space="0" w:color="000000"/>
+              <w:left w:val="single" w:sz="8" w:space="0" w:color="000000"/>
+              <w:bottom w:val="single" w:sz="8" w:space="0" w:color="000000"/>
+              <w:right w:val="single" w:sz="8" w:space="0" w:color="000000"/>
+            </w:tcBorders>
+            <w:shd w:val="clear" w:color="auto" w:fill="EA9999"/>
+            <w:tcMar>
+              <w:top w:w="100" w:type="dxa"/>
+              <w:left w:w="100" w:type="dxa"/>
+              <w:bottom w:w="100" w:type="dxa"/>
+              <w:right w:w="100" w:type="dxa"/>
+            </w:tcMar>
+            <w:hideMark/>
+          </w:tcPr>
+          <w:p>
+            <w:pPr>
+              <w:rPr>
+                <w:lang w:val="en"/>
+              </w:rPr>
+            </w:pPr>
+            <w:r>
+              <w:rPr>
+                <w:lang w:val="en"/>
+              </w:rPr>
+              <w:t>Route 2</w:t>
+            </w:r>
+          </w:p>
+          <w:p>
+            <w:pPr>
+              <w:rPr>
+                <w:lang w:val="en"/>
+              </w:rPr>
+            </w:pPr>
+            <w:r>
+              <w:rPr>
+                <w:lang w:val="en"/>
+              </w:rPr>
+              <w:t xml:space="preserve">(Requires </w:t>
+            </w:r>
+            <w:proofErr w:type="spellStart"/>
+            <w:r>
+              <w:rPr>
+                <w:lang w:val="en"/>
+              </w:rPr>
+              <w:t>Golbat</w:t>
+            </w:r>
+            <w:proofErr w:type="spellEnd"/>
+            <w:r>
+              <w:rPr>
+                <w:lang w:val="en"/>
+              </w:rPr>
+              <w:t>)</w:t>
+            </w:r>
+          </w:p>
+        </w:tc>
+      </w:tr>
+      <w:tr>
+        <w:trPr>
+          <w:jc w:val="center"/>
+        </w:trPr>
+        <w:tc>
+          <w:tcPr>
+            <w:tcW w:w="1365" w:type="dxa"/>
+            <w:tcBorders>
+              <w:top w:val="single" w:sz="8" w:space="0" w:color="000000"/>
+              <w:left w:val="single" w:sz="8" w:space="0" w:color="000000"/>
+              <w:bottom w:val="single" w:sz="8" w:space="0" w:color="000000"/>
+              <w:right w:val="single" w:sz="8" w:space="0" w:color="000000"/>
+            </w:tcBorders>
+            <w:shd w:val="clear" w:color="auto" w:fill="EA9999"/>
+            <w:tcMar>
+              <w:top w:w="100" w:type="dxa"/>
+              <w:left w:w="100" w:type="dxa"/>
+              <w:bottom w:w="100" w:type="dxa"/>
+              <w:right w:w="100" w:type="dxa"/>
+            </w:tcMar>
+            <w:hideMark/>
+          </w:tcPr>
+          <w:p>
+            <w:pPr>
+              <w:rPr>
+                <w:lang w:val="en"/>
+              </w:rPr>
+            </w:pPr>
+            <w:r>
+              <w:object w:dxaOrig="1185" w:dyaOrig="1110" w14:anchorId="1881CAF6">
+                <v:shape id="_x0000_i1031" type="#_x0000_t75" style="width:58.1pt;height:54.65pt" o:ole="">
+                  <v:imagedata r:id="rId38" o:title=""/>
+                </v:shape>
+                <o:OLEObject Type="Embed" ProgID="PBrush" ShapeID="_x0000_i1031" DrawAspect="Content" ObjectID="_1833353773" r:id="rId39"/>
+              </w:object>
+            </w:r>
+          </w:p>
+        </w:tc>
+        <w:tc>
+          <w:tcPr>
+            <w:tcW w:w="2340" w:type="dxa"/>
+            <w:tcBorders>
+              <w:top w:val="single" w:sz="8" w:space="0" w:color="000000"/>
+              <w:left w:val="single" w:sz="8" w:space="0" w:color="000000"/>
+              <w:bottom w:val="single" w:sz="8" w:space="0" w:color="000000"/>
+              <w:right w:val="single" w:sz="8" w:space="0" w:color="000000"/>
+            </w:tcBorders>
+            <w:shd w:val="clear" w:color="auto" w:fill="EA9999"/>
+            <w:tcMar>
+              <w:top w:w="100" w:type="dxa"/>
+              <w:left w:w="100" w:type="dxa"/>
+              <w:bottom w:w="100" w:type="dxa"/>
+              <w:right w:w="100" w:type="dxa"/>
+            </w:tcMar>
+            <w:hideMark/>
+          </w:tcPr>
+          <w:p>
+            <w:pPr>
+              <w:rPr>
+                <w:b/>
+                <w:lang w:val="en"/>
+              </w:rPr>
+            </w:pPr>
+            <w:r>
+              <w:rPr>
+                <w:b/>
+                <w:lang w:val="en"/>
+              </w:rPr>
+              <w:t xml:space="preserve"> </w:t>
+            </w:r>
+            <w:r>
+              <w:rPr>
+                <w:b/>
+                <w:lang w:val="en"/>
+              </w:rPr>
+              <w:t>Oddish</w:t>
+            </w:r>
+          </w:p>
+        </w:tc>
+        <w:tc>
+          <w:tcPr>
+            <w:tcW w:w="1065" w:type="dxa"/>
+            <w:tcBorders>
+              <w:top w:val="single" w:sz="8" w:space="0" w:color="000000"/>
+              <w:left w:val="single" w:sz="8" w:space="0" w:color="000000"/>
+              <w:bottom w:val="single" w:sz="8" w:space="0" w:color="000000"/>
+              <w:right w:val="single" w:sz="8" w:space="0" w:color="000000"/>
+            </w:tcBorders>
+            <w:shd w:val="clear" w:color="auto" w:fill="EA9999"/>
+            <w:tcMar>
+              <w:top w:w="100" w:type="dxa"/>
+              <w:left w:w="100" w:type="dxa"/>
+              <w:bottom w:w="100" w:type="dxa"/>
+              <w:right w:w="100" w:type="dxa"/>
+            </w:tcMar>
+            <w:hideMark/>
+          </w:tcPr>
+          <w:p>
+            <w:pPr>
+              <w:rPr>
+                <w:lang w:val="en"/>
+              </w:rPr>
+            </w:pPr>
+            <w:r>
+              <w:rPr>
+                <w:lang w:val="en"/>
+              </w:rPr>
+              <w:t xml:space="preserve">Trade </w:t>
+            </w:r>
+            <w:proofErr w:type="spellStart"/>
+            <w:r>
+              <w:rPr>
+                <w:lang w:val="en"/>
+              </w:rPr>
+              <w:t>Lv</w:t>
+            </w:r>
+            <w:proofErr w:type="spellEnd"/>
+          </w:p>
+        </w:tc>
+        <w:tc>
+          <w:tcPr>
+            <w:tcW w:w="3495" w:type="dxa"/>
+            <w:tcBorders>
+              <w:top w:val="single" w:sz="8" w:space="0" w:color="000000"/>
+              <w:left w:val="single" w:sz="8" w:space="0" w:color="000000"/>
+              <w:bottom w:val="single" w:sz="8" w:space="0" w:color="000000"/>
+              <w:right w:val="single" w:sz="8" w:space="0" w:color="000000"/>
+            </w:tcBorders>
+            <w:shd w:val="clear" w:color="auto" w:fill="EA9999"/>
+            <w:tcMar>
+              <w:top w:w="100" w:type="dxa"/>
+              <w:left w:w="100" w:type="dxa"/>
+              <w:bottom w:w="100" w:type="dxa"/>
+              <w:right w:w="100" w:type="dxa"/>
+            </w:tcMar>
+            <w:hideMark/>
+          </w:tcPr>
+          <w:p>
+            <w:pPr>
+              <w:rPr>
+                <w:lang w:val="en"/>
+              </w:rPr>
+            </w:pPr>
+            <w:r>
+              <w:rPr>
+                <w:lang w:val="en"/>
+              </w:rPr>
+              <w:t>Vermilion HM House</w:t>
+            </w:r>
+          </w:p>
+          <w:p>
+            <w:pPr>
+              <w:rPr>
+                <w:lang w:val="en"/>
+              </w:rPr>
+            </w:pPr>
+            <w:r>
+              <w:rPr>
+                <w:lang w:val="en"/>
+              </w:rPr>
+              <w:t xml:space="preserve">(Requires </w:t>
+            </w:r>
+            <w:proofErr w:type="spellStart"/>
+            <w:r>
+              <w:rPr>
+                <w:lang w:val="en"/>
+              </w:rPr>
+              <w:t>Nidoran_</w:t>
+            </w:r>
+            <w:r>
+              <w:rPr>
+                <w:lang w:val="en"/>
+              </w:rPr>
+              <w:t>M</w:t>
+            </w:r>
+            <w:proofErr w:type="spellEnd"/>
+            <w:r>
+              <w:rPr>
+                <w:lang w:val="en"/>
+              </w:rPr>
+              <w:t>)</w:t>
+            </w:r>
+          </w:p>
+        </w:tc>
+      </w:tr>
+      <w:tr>
+        <w:trPr>
+          <w:jc w:val="center"/>
+        </w:trPr>
+        <w:tc>
+          <w:tcPr>
+            <w:tcW w:w="1365" w:type="dxa"/>
+            <w:tcBorders>
+              <w:top w:val="single" w:sz="8" w:space="0" w:color="000000"/>
+              <w:left w:val="single" w:sz="8" w:space="0" w:color="000000"/>
+              <w:bottom w:val="single" w:sz="8" w:space="0" w:color="000000"/>
+              <w:right w:val="single" w:sz="8" w:space="0" w:color="000000"/>
+            </w:tcBorders>
+            <w:shd w:val="clear" w:color="auto" w:fill="EA9999"/>
+            <w:tcMar>
+              <w:top w:w="100" w:type="dxa"/>
+              <w:left w:w="100" w:type="dxa"/>
+              <w:bottom w:w="100" w:type="dxa"/>
+              <w:right w:w="100" w:type="dxa"/>
+            </w:tcMar>
+            <w:hideMark/>
+          </w:tcPr>
+          <w:p>
+            <w:pPr>
+              <w:rPr>
+                <w:lang w:val="en"/>
+              </w:rPr>
+            </w:pPr>
+            <w:r>
               <w:rPr>
                 <w:noProof/>
               </w:rPr>
-              <w:lastRenderedPageBreak/>
               <w:drawing>
-                <wp:inline distT="0" distB="0" distL="0" distR="0" wp14:anchorId="3835B8E0" wp14:editId="00024398">
+                <wp:inline distT="0" distB="0" distL="0" distR="0" wp14:anchorId="588FA5BC" wp14:editId="19D60167">
                   <wp:extent cx="739775" cy="739775"/>
-                  <wp:effectExtent l="0" t="0" r="3175" b="3175"/>
-                  <wp:docPr id="50" name="image23.png"/>
+                  <wp:effectExtent l="0" t="0" r="0" b="3175"/>
+                  <wp:docPr id="155" name="image123.png"/>
                   <wp:cNvGraphicFramePr/>
                   <a:graphic xmlns:a="http://schemas.openxmlformats.org/drawingml/2006/main">
                     <a:graphicData uri="http://schemas.openxmlformats.org/drawingml/2006/picture">
                       <pic:pic xmlns:pic="http://schemas.openxmlformats.org/drawingml/2006/picture">
                         <pic:nvPicPr>
-                          <pic:cNvPr id="50" name="image23.png"/>
+                          <pic:cNvPr id="155" name="image123.png"/>
                           <pic:cNvPicPr/>
                         </pic:nvPicPr>
                         <pic:blipFill>
-                          <a:blip r:embed="rId44"/>
+                          <a:blip r:embed="rId40"/>
                           <a:srcRect/>
                           <a:stretch>
                             <a:fillRect/>
@@ -6277,8 +5584,17 @@
                 <w:b/>
                 <w:lang w:val="en"/>
               </w:rPr>
-              <w:t>Alakazam</w:t>
-            </w:r>
+              <w:t xml:space="preserve"> </w:t>
+            </w:r>
+            <w:proofErr w:type="spellStart"/>
+            <w:r>
+              <w:rPr>
+                <w:b/>
+                <w:lang w:val="en"/>
+              </w:rPr>
+              <w:t>Flareon</w:t>
+            </w:r>
+            <w:proofErr w:type="spellEnd"/>
           </w:p>
         </w:tc>
         <w:tc>
@@ -6349,45 +5665,27 @@
               <w:rPr>
                 <w:lang w:val="en"/>
               </w:rPr>
-              <w:t>Cinnabar Island</w:t>
-            </w:r>
-            <w:r>
-              <w:rPr>
-                <w:lang w:val="en"/>
-              </w:rPr>
-              <w:t xml:space="preserve"> Lab</w:t>
-            </w:r>
-          </w:p>
-          <w:p>
-            <w:pPr>
-              <w:rPr>
-                <w:lang w:val="en"/>
-              </w:rPr>
-            </w:pPr>
-            <w:r>
-              <w:rPr>
-                <w:lang w:val="en"/>
-              </w:rPr>
-              <w:t>(Require</w:t>
-            </w:r>
-            <w:r>
-              <w:rPr>
-                <w:lang w:val="en"/>
-              </w:rPr>
-              <w:t>s</w:t>
-            </w:r>
-            <w:r>
-              <w:rPr>
-                <w:lang w:val="en"/>
-              </w:rPr>
-              <w:t xml:space="preserve"> </w:t>
+              <w:t>Route 11</w:t>
+            </w:r>
+          </w:p>
+          <w:p>
+            <w:pPr>
+              <w:rPr>
+                <w:lang w:val="en"/>
+              </w:rPr>
+            </w:pPr>
+            <w:r>
+              <w:rPr>
+                <w:lang w:val="en"/>
+              </w:rPr>
+              <w:t xml:space="preserve">(Requires </w:t>
             </w:r>
             <w:proofErr w:type="spellStart"/>
             <w:r>
               <w:rPr>
                 <w:lang w:val="en"/>
               </w:rPr>
-              <w:t>Kadabra</w:t>
+              <w:t>Farfetchd</w:t>
             </w:r>
             <w:proofErr w:type="spellEnd"/>
             <w:r>
@@ -6428,11 +5726,849 @@
               </w:rPr>
             </w:pPr>
             <w:r>
+              <w:object w:dxaOrig="1170" w:dyaOrig="1095" w14:anchorId="36EE6C08">
+                <v:shape id="_x0000_i1032" type="#_x0000_t75" style="width:58.1pt;height:54.65pt" o:ole="">
+                  <v:imagedata r:id="rId41" o:title=""/>
+                </v:shape>
+                <o:OLEObject Type="Embed" ProgID="PBrush" ShapeID="_x0000_i1032" DrawAspect="Content" ObjectID="_1833353774" r:id="rId42"/>
+              </w:object>
+            </w:r>
+          </w:p>
+        </w:tc>
+        <w:tc>
+          <w:tcPr>
+            <w:tcW w:w="2340" w:type="dxa"/>
+            <w:tcBorders>
+              <w:top w:val="single" w:sz="8" w:space="0" w:color="000000"/>
+              <w:left w:val="single" w:sz="8" w:space="0" w:color="000000"/>
+              <w:bottom w:val="single" w:sz="8" w:space="0" w:color="000000"/>
+              <w:right w:val="single" w:sz="8" w:space="0" w:color="000000"/>
+            </w:tcBorders>
+            <w:shd w:val="clear" w:color="auto" w:fill="EA9999"/>
+            <w:tcMar>
+              <w:top w:w="100" w:type="dxa"/>
+              <w:left w:w="100" w:type="dxa"/>
+              <w:bottom w:w="100" w:type="dxa"/>
+              <w:right w:w="100" w:type="dxa"/>
+            </w:tcMar>
+            <w:hideMark/>
+          </w:tcPr>
+          <w:p>
+            <w:pPr>
+              <w:rPr>
+                <w:b/>
+                <w:lang w:val="en"/>
+              </w:rPr>
+            </w:pPr>
+            <w:proofErr w:type="spellStart"/>
+            <w:r>
+              <w:rPr>
+                <w:b/>
+                <w:lang w:val="en"/>
+              </w:rPr>
+              <w:t>Tentacool</w:t>
+            </w:r>
+            <w:proofErr w:type="spellEnd"/>
+          </w:p>
+        </w:tc>
+        <w:tc>
+          <w:tcPr>
+            <w:tcW w:w="1065" w:type="dxa"/>
+            <w:tcBorders>
+              <w:top w:val="single" w:sz="8" w:space="0" w:color="000000"/>
+              <w:left w:val="single" w:sz="8" w:space="0" w:color="000000"/>
+              <w:bottom w:val="single" w:sz="8" w:space="0" w:color="000000"/>
+              <w:right w:val="single" w:sz="8" w:space="0" w:color="000000"/>
+            </w:tcBorders>
+            <w:shd w:val="clear" w:color="auto" w:fill="EA9999"/>
+            <w:tcMar>
+              <w:top w:w="100" w:type="dxa"/>
+              <w:left w:w="100" w:type="dxa"/>
+              <w:bottom w:w="100" w:type="dxa"/>
+              <w:right w:w="100" w:type="dxa"/>
+            </w:tcMar>
+            <w:hideMark/>
+          </w:tcPr>
+          <w:p>
+            <w:pPr>
+              <w:rPr>
+                <w:lang w:val="en"/>
+              </w:rPr>
+            </w:pPr>
+            <w:r>
+              <w:rPr>
+                <w:lang w:val="en"/>
+              </w:rPr>
+              <w:t xml:space="preserve">Trade </w:t>
+            </w:r>
+            <w:proofErr w:type="spellStart"/>
+            <w:r>
+              <w:rPr>
+                <w:lang w:val="en"/>
+              </w:rPr>
+              <w:t>Lv</w:t>
+            </w:r>
+            <w:proofErr w:type="spellEnd"/>
+          </w:p>
+        </w:tc>
+        <w:tc>
+          <w:tcPr>
+            <w:tcW w:w="3495" w:type="dxa"/>
+            <w:tcBorders>
+              <w:top w:val="single" w:sz="8" w:space="0" w:color="000000"/>
+              <w:left w:val="single" w:sz="8" w:space="0" w:color="000000"/>
+              <w:bottom w:val="single" w:sz="8" w:space="0" w:color="000000"/>
+              <w:right w:val="single" w:sz="8" w:space="0" w:color="000000"/>
+            </w:tcBorders>
+            <w:shd w:val="clear" w:color="auto" w:fill="EA9999"/>
+            <w:tcMar>
+              <w:top w:w="100" w:type="dxa"/>
+              <w:left w:w="100" w:type="dxa"/>
+              <w:bottom w:w="100" w:type="dxa"/>
+              <w:right w:w="100" w:type="dxa"/>
+            </w:tcMar>
+            <w:hideMark/>
+          </w:tcPr>
+          <w:p>
+            <w:pPr>
+              <w:rPr>
+                <w:lang w:val="en"/>
+              </w:rPr>
+            </w:pPr>
+            <w:r>
+              <w:rPr>
+                <w:lang w:val="en"/>
+              </w:rPr>
+              <w:t>Vermilion HM House</w:t>
+            </w:r>
+          </w:p>
+          <w:p>
+            <w:pPr>
+              <w:rPr>
+                <w:lang w:val="en"/>
+              </w:rPr>
+            </w:pPr>
+            <w:r>
+              <w:rPr>
+                <w:lang w:val="en"/>
+              </w:rPr>
+              <w:t>(Require</w:t>
+            </w:r>
+            <w:r>
+              <w:rPr>
+                <w:lang w:val="en"/>
+              </w:rPr>
+              <w:t>s</w:t>
+            </w:r>
+            <w:r>
+              <w:rPr>
+                <w:lang w:val="en"/>
+              </w:rPr>
+              <w:t xml:space="preserve"> </w:t>
+            </w:r>
+            <w:proofErr w:type="spellStart"/>
+            <w:r>
+              <w:rPr>
+                <w:lang w:val="en"/>
+              </w:rPr>
+              <w:t>Butterfree</w:t>
+            </w:r>
+            <w:proofErr w:type="spellEnd"/>
+            <w:r>
+              <w:rPr>
+                <w:lang w:val="en"/>
+              </w:rPr>
+              <w:t>)</w:t>
+            </w:r>
+          </w:p>
+        </w:tc>
+      </w:tr>
+      <w:tr>
+        <w:trPr>
+          <w:jc w:val="center"/>
+        </w:trPr>
+        <w:tc>
+          <w:tcPr>
+            <w:tcW w:w="1365" w:type="dxa"/>
+            <w:tcBorders>
+              <w:top w:val="single" w:sz="8" w:space="0" w:color="000000"/>
+              <w:left w:val="single" w:sz="8" w:space="0" w:color="000000"/>
+              <w:bottom w:val="single" w:sz="8" w:space="0" w:color="000000"/>
+              <w:right w:val="single" w:sz="8" w:space="0" w:color="000000"/>
+            </w:tcBorders>
+            <w:shd w:val="clear" w:color="auto" w:fill="EA9999"/>
+            <w:tcMar>
+              <w:top w:w="100" w:type="dxa"/>
+              <w:left w:w="100" w:type="dxa"/>
+              <w:bottom w:w="100" w:type="dxa"/>
+              <w:right w:w="100" w:type="dxa"/>
+            </w:tcMar>
+            <w:hideMark/>
+          </w:tcPr>
+          <w:p>
+            <w:pPr>
+              <w:rPr>
+                <w:lang w:val="en"/>
+              </w:rPr>
+            </w:pPr>
+            <w:r>
+              <w:object w:dxaOrig="1305" w:dyaOrig="1185" w14:anchorId="4E137F21">
+                <v:shape id="_x0000_i1033" type="#_x0000_t75" style="width:58.1pt;height:52.9pt" o:ole="">
+                  <v:imagedata r:id="rId43" o:title=""/>
+                </v:shape>
+                <o:OLEObject Type="Embed" ProgID="PBrush" ShapeID="_x0000_i1033" DrawAspect="Content" ObjectID="_1833353775" r:id="rId44"/>
+              </w:object>
+            </w:r>
+          </w:p>
+        </w:tc>
+        <w:tc>
+          <w:tcPr>
+            <w:tcW w:w="2340" w:type="dxa"/>
+            <w:tcBorders>
+              <w:top w:val="single" w:sz="8" w:space="0" w:color="000000"/>
+              <w:left w:val="single" w:sz="8" w:space="0" w:color="000000"/>
+              <w:bottom w:val="single" w:sz="8" w:space="0" w:color="000000"/>
+              <w:right w:val="single" w:sz="8" w:space="0" w:color="000000"/>
+            </w:tcBorders>
+            <w:shd w:val="clear" w:color="auto" w:fill="EA9999"/>
+            <w:tcMar>
+              <w:top w:w="100" w:type="dxa"/>
+              <w:left w:w="100" w:type="dxa"/>
+              <w:bottom w:w="100" w:type="dxa"/>
+              <w:right w:w="100" w:type="dxa"/>
+            </w:tcMar>
+            <w:hideMark/>
+          </w:tcPr>
+          <w:p>
+            <w:pPr>
+              <w:rPr>
+                <w:b/>
+                <w:lang w:val="en"/>
+              </w:rPr>
+            </w:pPr>
+            <w:proofErr w:type="spellStart"/>
+            <w:r>
+              <w:rPr>
+                <w:b/>
+                <w:lang w:val="en"/>
+              </w:rPr>
+              <w:t>P</w:t>
+            </w:r>
+            <w:r>
+              <w:rPr>
+                <w:b/>
+                <w:lang w:val="en"/>
+              </w:rPr>
+              <w:t>insir</w:t>
+            </w:r>
+            <w:proofErr w:type="spellEnd"/>
+          </w:p>
+        </w:tc>
+        <w:tc>
+          <w:tcPr>
+            <w:tcW w:w="1065" w:type="dxa"/>
+            <w:tcBorders>
+              <w:top w:val="single" w:sz="8" w:space="0" w:color="000000"/>
+              <w:left w:val="single" w:sz="8" w:space="0" w:color="000000"/>
+              <w:bottom w:val="single" w:sz="8" w:space="0" w:color="000000"/>
+              <w:right w:val="single" w:sz="8" w:space="0" w:color="000000"/>
+            </w:tcBorders>
+            <w:shd w:val="clear" w:color="auto" w:fill="EA9999"/>
+            <w:tcMar>
+              <w:top w:w="100" w:type="dxa"/>
+              <w:left w:w="100" w:type="dxa"/>
+              <w:bottom w:w="100" w:type="dxa"/>
+              <w:right w:w="100" w:type="dxa"/>
+            </w:tcMar>
+            <w:hideMark/>
+          </w:tcPr>
+          <w:p>
+            <w:pPr>
+              <w:rPr>
+                <w:lang w:val="en"/>
+              </w:rPr>
+            </w:pPr>
+            <w:r>
+              <w:rPr>
+                <w:lang w:val="en"/>
+              </w:rPr>
+              <w:t xml:space="preserve">Trade </w:t>
+            </w:r>
+            <w:proofErr w:type="spellStart"/>
+            <w:r>
+              <w:rPr>
+                <w:lang w:val="en"/>
+              </w:rPr>
+              <w:t>Lv</w:t>
+            </w:r>
+            <w:proofErr w:type="spellEnd"/>
+          </w:p>
+        </w:tc>
+        <w:tc>
+          <w:tcPr>
+            <w:tcW w:w="3495" w:type="dxa"/>
+            <w:tcBorders>
+              <w:top w:val="single" w:sz="8" w:space="0" w:color="000000"/>
+              <w:left w:val="single" w:sz="8" w:space="0" w:color="000000"/>
+              <w:bottom w:val="single" w:sz="8" w:space="0" w:color="000000"/>
+              <w:right w:val="single" w:sz="8" w:space="0" w:color="000000"/>
+            </w:tcBorders>
+            <w:shd w:val="clear" w:color="auto" w:fill="EA9999"/>
+            <w:tcMar>
+              <w:top w:w="100" w:type="dxa"/>
+              <w:left w:w="100" w:type="dxa"/>
+              <w:bottom w:w="100" w:type="dxa"/>
+              <w:right w:w="100" w:type="dxa"/>
+            </w:tcMar>
+            <w:hideMark/>
+          </w:tcPr>
+          <w:p>
+            <w:pPr>
+              <w:rPr>
+                <w:lang w:val="en"/>
+              </w:rPr>
+            </w:pPr>
+            <w:r>
+              <w:rPr>
+                <w:lang w:val="en"/>
+              </w:rPr>
+              <w:t>Route 18</w:t>
+            </w:r>
+          </w:p>
+          <w:p>
+            <w:pPr>
+              <w:rPr>
+                <w:lang w:val="en"/>
+              </w:rPr>
+            </w:pPr>
+            <w:r>
+              <w:rPr>
+                <w:lang w:val="en"/>
+              </w:rPr>
+              <w:t>(Require</w:t>
+            </w:r>
+            <w:r>
+              <w:rPr>
+                <w:lang w:val="en"/>
+              </w:rPr>
+              <w:t>s</w:t>
+            </w:r>
+            <w:r>
+              <w:rPr>
+                <w:lang w:val="en"/>
+              </w:rPr>
+              <w:t xml:space="preserve"> </w:t>
+            </w:r>
+            <w:r>
+              <w:rPr>
+                <w:lang w:val="en"/>
+              </w:rPr>
+              <w:t>Chansey</w:t>
+            </w:r>
+            <w:r>
+              <w:rPr>
+                <w:lang w:val="en"/>
+              </w:rPr>
+              <w:t>)</w:t>
+            </w:r>
+          </w:p>
+        </w:tc>
+      </w:tr>
+      <w:tr>
+        <w:trPr>
+          <w:jc w:val="center"/>
+        </w:trPr>
+        <w:tc>
+          <w:tcPr>
+            <w:tcW w:w="1365" w:type="dxa"/>
+            <w:tcBorders>
+              <w:top w:val="single" w:sz="8" w:space="0" w:color="000000"/>
+              <w:left w:val="single" w:sz="8" w:space="0" w:color="000000"/>
+              <w:bottom w:val="single" w:sz="8" w:space="0" w:color="000000"/>
+              <w:right w:val="single" w:sz="8" w:space="0" w:color="000000"/>
+            </w:tcBorders>
+            <w:shd w:val="clear" w:color="auto" w:fill="EA9999"/>
+            <w:tcMar>
+              <w:top w:w="100" w:type="dxa"/>
+              <w:left w:w="100" w:type="dxa"/>
+              <w:bottom w:w="100" w:type="dxa"/>
+              <w:right w:w="100" w:type="dxa"/>
+            </w:tcMar>
+            <w:hideMark/>
+          </w:tcPr>
+          <w:p>
+            <w:pPr>
+              <w:rPr>
+                <w:lang w:val="en"/>
+              </w:rPr>
+            </w:pPr>
+            <w:r>
+              <w:rPr>
+                <w:noProof/>
+                <w:lang w:val="en"/>
+              </w:rPr>
+              <w:lastRenderedPageBreak/>
+              <w:drawing>
+                <wp:inline distT="0" distB="0" distL="0" distR="0" wp14:anchorId="4B0FBF66" wp14:editId="362E987A">
+                  <wp:extent cx="695325" cy="695325"/>
+                  <wp:effectExtent l="0" t="0" r="0" b="9525"/>
+                  <wp:docPr id="714347525" name="Picture 36"/>
+                  <wp:cNvGraphicFramePr>
+                    <a:graphicFrameLocks xmlns:a="http://schemas.openxmlformats.org/drawingml/2006/main" noChangeAspect="1"/>
+                  </wp:cNvGraphicFramePr>
+                  <a:graphic xmlns:a="http://schemas.openxmlformats.org/drawingml/2006/main">
+                    <a:graphicData uri="http://schemas.openxmlformats.org/drawingml/2006/picture">
+                      <pic:pic xmlns:pic="http://schemas.openxmlformats.org/drawingml/2006/picture">
+                        <pic:nvPicPr>
+                          <pic:cNvPr id="0" name="image246.png"/>
+                          <pic:cNvPicPr>
+                            <a:picLocks noChangeAspect="1" noChangeArrowheads="1"/>
+                          </pic:cNvPicPr>
+                        </pic:nvPicPr>
+                        <pic:blipFill>
+                          <a:blip r:embed="rId45">
+                            <a:extLst>
+                              <a:ext uri="{28A0092B-C50C-407E-A947-70E740481C1C}">
+                                <a14:useLocalDpi xmlns:a14="http://schemas.microsoft.com/office/drawing/2010/main" val="0"/>
+                              </a:ext>
+                            </a:extLst>
+                          </a:blip>
+                          <a:srcRect/>
+                          <a:stretch>
+                            <a:fillRect/>
+                          </a:stretch>
+                        </pic:blipFill>
+                        <pic:spPr bwMode="auto">
+                          <a:xfrm>
+                            <a:off x="0" y="0"/>
+                            <a:ext cx="695325" cy="695325"/>
+                          </a:xfrm>
+                          <a:prstGeom prst="rect">
+                            <a:avLst/>
+                          </a:prstGeom>
+                          <a:noFill/>
+                          <a:ln>
+                            <a:noFill/>
+                          </a:ln>
+                        </pic:spPr>
+                      </pic:pic>
+                    </a:graphicData>
+                  </a:graphic>
+                </wp:inline>
+              </w:drawing>
+            </w:r>
+          </w:p>
+        </w:tc>
+        <w:tc>
+          <w:tcPr>
+            <w:tcW w:w="2340" w:type="dxa"/>
+            <w:tcBorders>
+              <w:top w:val="single" w:sz="8" w:space="0" w:color="000000"/>
+              <w:left w:val="single" w:sz="8" w:space="0" w:color="000000"/>
+              <w:bottom w:val="single" w:sz="8" w:space="0" w:color="000000"/>
+              <w:right w:val="single" w:sz="8" w:space="0" w:color="000000"/>
+            </w:tcBorders>
+            <w:shd w:val="clear" w:color="auto" w:fill="EA9999"/>
+            <w:tcMar>
+              <w:top w:w="100" w:type="dxa"/>
+              <w:left w:w="100" w:type="dxa"/>
+              <w:bottom w:w="100" w:type="dxa"/>
+              <w:right w:w="100" w:type="dxa"/>
+            </w:tcMar>
+            <w:hideMark/>
+          </w:tcPr>
+          <w:p>
+            <w:pPr>
+              <w:rPr>
+                <w:b/>
+                <w:lang w:val="en"/>
+              </w:rPr>
+            </w:pPr>
+            <w:proofErr w:type="spellStart"/>
+            <w:r>
+              <w:rPr>
+                <w:b/>
+                <w:lang w:val="en"/>
+              </w:rPr>
+              <w:t>Dratini</w:t>
+            </w:r>
+            <w:proofErr w:type="spellEnd"/>
+          </w:p>
+        </w:tc>
+        <w:tc>
+          <w:tcPr>
+            <w:tcW w:w="1065" w:type="dxa"/>
+            <w:tcBorders>
+              <w:top w:val="single" w:sz="8" w:space="0" w:color="000000"/>
+              <w:left w:val="single" w:sz="8" w:space="0" w:color="000000"/>
+              <w:bottom w:val="single" w:sz="8" w:space="0" w:color="000000"/>
+              <w:right w:val="single" w:sz="8" w:space="0" w:color="000000"/>
+            </w:tcBorders>
+            <w:shd w:val="clear" w:color="auto" w:fill="EA9999"/>
+            <w:tcMar>
+              <w:top w:w="100" w:type="dxa"/>
+              <w:left w:w="100" w:type="dxa"/>
+              <w:bottom w:w="100" w:type="dxa"/>
+              <w:right w:w="100" w:type="dxa"/>
+            </w:tcMar>
+            <w:hideMark/>
+          </w:tcPr>
+          <w:p>
+            <w:pPr>
+              <w:rPr>
+                <w:lang w:val="en"/>
+              </w:rPr>
+            </w:pPr>
+            <w:r>
+              <w:rPr>
+                <w:lang w:val="en"/>
+              </w:rPr>
+              <w:t xml:space="preserve">Trade </w:t>
+            </w:r>
+            <w:proofErr w:type="spellStart"/>
+            <w:r>
+              <w:rPr>
+                <w:lang w:val="en"/>
+              </w:rPr>
+              <w:t>Lv</w:t>
+            </w:r>
+            <w:proofErr w:type="spellEnd"/>
+          </w:p>
+        </w:tc>
+        <w:tc>
+          <w:tcPr>
+            <w:tcW w:w="3495" w:type="dxa"/>
+            <w:tcBorders>
+              <w:top w:val="single" w:sz="8" w:space="0" w:color="000000"/>
+              <w:left w:val="single" w:sz="8" w:space="0" w:color="000000"/>
+              <w:bottom w:val="single" w:sz="8" w:space="0" w:color="000000"/>
+              <w:right w:val="single" w:sz="8" w:space="0" w:color="000000"/>
+            </w:tcBorders>
+            <w:shd w:val="clear" w:color="auto" w:fill="EA9999"/>
+            <w:tcMar>
+              <w:top w:w="100" w:type="dxa"/>
+              <w:left w:w="100" w:type="dxa"/>
+              <w:bottom w:w="100" w:type="dxa"/>
+              <w:right w:w="100" w:type="dxa"/>
+            </w:tcMar>
+            <w:hideMark/>
+          </w:tcPr>
+          <w:p>
+            <w:pPr>
+              <w:rPr>
+                <w:lang w:val="en"/>
+              </w:rPr>
+            </w:pPr>
+            <w:r>
+              <w:rPr>
+                <w:lang w:val="en"/>
+              </w:rPr>
+              <w:t>Cinnabar Island</w:t>
+            </w:r>
+            <w:r>
+              <w:rPr>
+                <w:lang w:val="en"/>
+              </w:rPr>
+              <w:t xml:space="preserve"> Lab</w:t>
+            </w:r>
+          </w:p>
+          <w:p>
+            <w:pPr>
+              <w:rPr>
+                <w:lang w:val="en"/>
+              </w:rPr>
+            </w:pPr>
+            <w:r>
+              <w:rPr>
+                <w:lang w:val="en"/>
+              </w:rPr>
+              <w:t>(Require</w:t>
+            </w:r>
+            <w:r>
+              <w:rPr>
+                <w:lang w:val="en"/>
+              </w:rPr>
+              <w:t>s</w:t>
+            </w:r>
+            <w:r>
+              <w:rPr>
+                <w:lang w:val="en"/>
+              </w:rPr>
+              <w:t xml:space="preserve"> </w:t>
+            </w:r>
+            <w:proofErr w:type="spellStart"/>
+            <w:r>
+              <w:rPr>
+                <w:lang w:val="en"/>
+              </w:rPr>
+              <w:t>Staryu</w:t>
+            </w:r>
+            <w:proofErr w:type="spellEnd"/>
+            <w:r>
+              <w:rPr>
+                <w:lang w:val="en"/>
+              </w:rPr>
+              <w:t>)</w:t>
+            </w:r>
+          </w:p>
+        </w:tc>
+      </w:tr>
+      <w:tr>
+        <w:trPr>
+          <w:jc w:val="center"/>
+        </w:trPr>
+        <w:tc>
+          <w:tcPr>
+            <w:tcW w:w="1365" w:type="dxa"/>
+            <w:tcBorders>
+              <w:top w:val="single" w:sz="8" w:space="0" w:color="000000"/>
+              <w:left w:val="single" w:sz="8" w:space="0" w:color="000000"/>
+              <w:bottom w:val="single" w:sz="8" w:space="0" w:color="000000"/>
+              <w:right w:val="single" w:sz="8" w:space="0" w:color="000000"/>
+            </w:tcBorders>
+            <w:shd w:val="clear" w:color="auto" w:fill="EA9999"/>
+            <w:tcMar>
+              <w:top w:w="100" w:type="dxa"/>
+              <w:left w:w="100" w:type="dxa"/>
+              <w:bottom w:w="100" w:type="dxa"/>
+              <w:right w:w="100" w:type="dxa"/>
+            </w:tcMar>
+            <w:hideMark/>
+          </w:tcPr>
+          <w:p>
+            <w:pPr>
+              <w:rPr>
+                <w:lang w:val="en"/>
+              </w:rPr>
+            </w:pPr>
+            <w:r>
+              <w:rPr>
+                <w:noProof/>
+              </w:rPr>
+              <w:drawing>
+                <wp:inline distT="0" distB="0" distL="0" distR="0" wp14:anchorId="3835B8E0" wp14:editId="00024398">
+                  <wp:extent cx="739775" cy="739775"/>
+                  <wp:effectExtent l="0" t="0" r="3175" b="3175"/>
+                  <wp:docPr id="50" name="image23.png"/>
+                  <wp:cNvGraphicFramePr/>
+                  <a:graphic xmlns:a="http://schemas.openxmlformats.org/drawingml/2006/main">
+                    <a:graphicData uri="http://schemas.openxmlformats.org/drawingml/2006/picture">
+                      <pic:pic xmlns:pic="http://schemas.openxmlformats.org/drawingml/2006/picture">
+                        <pic:nvPicPr>
+                          <pic:cNvPr id="50" name="image23.png"/>
+                          <pic:cNvPicPr/>
+                        </pic:nvPicPr>
+                        <pic:blipFill>
+                          <a:blip r:embed="rId46"/>
+                          <a:srcRect/>
+                          <a:stretch>
+                            <a:fillRect/>
+                          </a:stretch>
+                        </pic:blipFill>
+                        <pic:spPr>
+                          <a:xfrm>
+                            <a:off x="0" y="0"/>
+                            <a:ext cx="739775" cy="739775"/>
+                          </a:xfrm>
+                          <a:prstGeom prst="rect">
+                            <a:avLst/>
+                          </a:prstGeom>
+                          <a:ln/>
+                        </pic:spPr>
+                      </pic:pic>
+                    </a:graphicData>
+                  </a:graphic>
+                </wp:inline>
+              </w:drawing>
+            </w:r>
+          </w:p>
+        </w:tc>
+        <w:tc>
+          <w:tcPr>
+            <w:tcW w:w="2340" w:type="dxa"/>
+            <w:tcBorders>
+              <w:top w:val="single" w:sz="8" w:space="0" w:color="000000"/>
+              <w:left w:val="single" w:sz="8" w:space="0" w:color="000000"/>
+              <w:bottom w:val="single" w:sz="8" w:space="0" w:color="000000"/>
+              <w:right w:val="single" w:sz="8" w:space="0" w:color="000000"/>
+            </w:tcBorders>
+            <w:shd w:val="clear" w:color="auto" w:fill="EA9999"/>
+            <w:tcMar>
+              <w:top w:w="100" w:type="dxa"/>
+              <w:left w:w="100" w:type="dxa"/>
+              <w:bottom w:w="100" w:type="dxa"/>
+              <w:right w:w="100" w:type="dxa"/>
+            </w:tcMar>
+            <w:hideMark/>
+          </w:tcPr>
+          <w:p>
+            <w:pPr>
+              <w:rPr>
+                <w:b/>
+                <w:lang w:val="en"/>
+              </w:rPr>
+            </w:pPr>
+            <w:r>
+              <w:rPr>
+                <w:b/>
+                <w:lang w:val="en"/>
+              </w:rPr>
+              <w:t>Alakazam</w:t>
+            </w:r>
+          </w:p>
+        </w:tc>
+        <w:tc>
+          <w:tcPr>
+            <w:tcW w:w="1065" w:type="dxa"/>
+            <w:tcBorders>
+              <w:top w:val="single" w:sz="8" w:space="0" w:color="000000"/>
+              <w:left w:val="single" w:sz="8" w:space="0" w:color="000000"/>
+              <w:bottom w:val="single" w:sz="8" w:space="0" w:color="000000"/>
+              <w:right w:val="single" w:sz="8" w:space="0" w:color="000000"/>
+            </w:tcBorders>
+            <w:shd w:val="clear" w:color="auto" w:fill="EA9999"/>
+            <w:tcMar>
+              <w:top w:w="100" w:type="dxa"/>
+              <w:left w:w="100" w:type="dxa"/>
+              <w:bottom w:w="100" w:type="dxa"/>
+              <w:right w:w="100" w:type="dxa"/>
+            </w:tcMar>
+            <w:hideMark/>
+          </w:tcPr>
+          <w:p>
+            <w:pPr>
+              <w:rPr>
+                <w:lang w:val="en"/>
+              </w:rPr>
+            </w:pPr>
+            <w:r>
+              <w:rPr>
+                <w:lang w:val="en"/>
+              </w:rPr>
+              <w:t xml:space="preserve">Trade </w:t>
+            </w:r>
+            <w:proofErr w:type="spellStart"/>
+            <w:r>
+              <w:rPr>
+                <w:lang w:val="en"/>
+              </w:rPr>
+              <w:t>Lv</w:t>
+            </w:r>
+            <w:proofErr w:type="spellEnd"/>
+          </w:p>
+        </w:tc>
+        <w:tc>
+          <w:tcPr>
+            <w:tcW w:w="3495" w:type="dxa"/>
+            <w:tcBorders>
+              <w:top w:val="single" w:sz="8" w:space="0" w:color="000000"/>
+              <w:left w:val="single" w:sz="8" w:space="0" w:color="000000"/>
+              <w:bottom w:val="single" w:sz="8" w:space="0" w:color="000000"/>
+              <w:right w:val="single" w:sz="8" w:space="0" w:color="000000"/>
+            </w:tcBorders>
+            <w:shd w:val="clear" w:color="auto" w:fill="EA9999"/>
+            <w:tcMar>
+              <w:top w:w="100" w:type="dxa"/>
+              <w:left w:w="100" w:type="dxa"/>
+              <w:bottom w:w="100" w:type="dxa"/>
+              <w:right w:w="100" w:type="dxa"/>
+            </w:tcMar>
+            <w:hideMark/>
+          </w:tcPr>
+          <w:p>
+            <w:pPr>
+              <w:rPr>
+                <w:lang w:val="en"/>
+              </w:rPr>
+            </w:pPr>
+            <w:r>
+              <w:rPr>
+                <w:lang w:val="en"/>
+              </w:rPr>
+              <w:t>Cinnabar Island</w:t>
+            </w:r>
+            <w:r>
+              <w:rPr>
+                <w:lang w:val="en"/>
+              </w:rPr>
+              <w:t xml:space="preserve"> Lab</w:t>
+            </w:r>
+          </w:p>
+          <w:p>
+            <w:pPr>
+              <w:rPr>
+                <w:lang w:val="en"/>
+              </w:rPr>
+            </w:pPr>
+            <w:r>
+              <w:rPr>
+                <w:lang w:val="en"/>
+              </w:rPr>
+              <w:t>(Require</w:t>
+            </w:r>
+            <w:r>
+              <w:rPr>
+                <w:lang w:val="en"/>
+              </w:rPr>
+              <w:t>s</w:t>
+            </w:r>
+            <w:r>
+              <w:rPr>
+                <w:lang w:val="en"/>
+              </w:rPr>
+              <w:t xml:space="preserve"> </w:t>
+            </w:r>
+            <w:proofErr w:type="spellStart"/>
+            <w:r>
+              <w:rPr>
+                <w:lang w:val="en"/>
+              </w:rPr>
+              <w:t>Kadabra</w:t>
+            </w:r>
+            <w:proofErr w:type="spellEnd"/>
+            <w:r>
+              <w:rPr>
+                <w:lang w:val="en"/>
+              </w:rPr>
+              <w:t>)</w:t>
+            </w:r>
+          </w:p>
+        </w:tc>
+      </w:tr>
+      <w:tr>
+        <w:trPr>
+          <w:jc w:val="center"/>
+        </w:trPr>
+        <w:tc>
+          <w:tcPr>
+            <w:tcW w:w="1365" w:type="dxa"/>
+            <w:tcBorders>
+              <w:top w:val="single" w:sz="8" w:space="0" w:color="000000"/>
+              <w:left w:val="single" w:sz="8" w:space="0" w:color="000000"/>
+              <w:bottom w:val="single" w:sz="8" w:space="0" w:color="000000"/>
+              <w:right w:val="single" w:sz="8" w:space="0" w:color="000000"/>
+            </w:tcBorders>
+            <w:shd w:val="clear" w:color="auto" w:fill="EA9999"/>
+            <w:tcMar>
+              <w:top w:w="100" w:type="dxa"/>
+              <w:left w:w="100" w:type="dxa"/>
+              <w:bottom w:w="100" w:type="dxa"/>
+              <w:right w:w="100" w:type="dxa"/>
+            </w:tcMar>
+            <w:hideMark/>
+          </w:tcPr>
+          <w:p>
+            <w:pPr>
+              <w:rPr>
+                <w:lang w:val="en"/>
+              </w:rPr>
+            </w:pPr>
+            <w:r>
               <w:object w:dxaOrig="1410" w:dyaOrig="1365" w14:anchorId="189EDD29">
-                <v:shape id="_x0000_i1034" type="#_x0000_t75" style="width:58.5pt;height:57pt" o:ole="">
-                  <v:imagedata r:id="rId45" o:title=""/>
+                <v:shape id="_x0000_i1034" type="#_x0000_t75" style="width:58.1pt;height:57.25pt" o:ole="">
+                  <v:imagedata r:id="rId47" o:title=""/>
                 </v:shape>
-                <o:OLEObject Type="Embed" ProgID="PBrush" ShapeID="_x0000_i1034" DrawAspect="Content" ObjectID="_1832739336" r:id="rId46"/>
+                <o:OLEObject Type="Embed" ProgID="PBrush" ShapeID="_x0000_i1034" DrawAspect="Content" ObjectID="_1833353776" r:id="rId48"/>
               </w:object>
             </w:r>
           </w:p>
@@ -6637,7 +6773,7 @@
                           <pic:cNvPicPr/>
                         </pic:nvPicPr>
                         <pic:blipFill>
-                          <a:blip r:embed="rId47"/>
+                          <a:blip r:embed="rId49"/>
                           <a:srcRect/>
                           <a:stretch>
                             <a:fillRect/>
@@ -6867,10 +7003,10 @@
             </w:pPr>
             <w:r>
               <w:object w:dxaOrig="900" w:dyaOrig="885" w14:anchorId="18F917CD">
-                <v:shape id="_x0000_i1035" type="#_x0000_t75" style="width:63.75pt;height:63pt" o:ole="">
-                  <v:imagedata r:id="rId48" o:title=""/>
+                <v:shape id="_x0000_i1035" type="#_x0000_t75" style="width:64.2pt;height:63.35pt" o:ole="">
+                  <v:imagedata r:id="rId50" o:title=""/>
                 </v:shape>
-                <o:OLEObject Type="Embed" ProgID="PBrush" ShapeID="_x0000_i1035" DrawAspect="Content" ObjectID="_1832739337" r:id="rId49"/>
+                <o:OLEObject Type="Embed" ProgID="PBrush" ShapeID="_x0000_i1035" DrawAspect="Content" ObjectID="_1833353777" r:id="rId51"/>
               </w:object>
             </w:r>
           </w:p>
@@ -7019,10 +7155,10 @@
           <w:p>
             <w:r>
               <w:object w:dxaOrig="870" w:dyaOrig="810" w14:anchorId="701BB6D6">
-                <v:shape id="_x0000_i1036" type="#_x0000_t75" style="width:54.75pt;height:51pt" o:ole="">
-                  <v:imagedata r:id="rId50" o:title=""/>
+                <v:shape id="_x0000_i1036" type="#_x0000_t75" style="width:54.65pt;height:51.2pt" o:ole="">
+                  <v:imagedata r:id="rId52" o:title=""/>
                 </v:shape>
-                <o:OLEObject Type="Embed" ProgID="PBrush" ShapeID="_x0000_i1036" DrawAspect="Content" ObjectID="_1832739338" r:id="rId51"/>
+                <o:OLEObject Type="Embed" ProgID="PBrush" ShapeID="_x0000_i1036" DrawAspect="Content" ObjectID="_1833353778" r:id="rId53"/>
               </w:object>
             </w:r>
           </w:p>
@@ -7169,10 +7305,10 @@
           <w:p>
             <w:r>
               <w:object w:dxaOrig="1305" w:dyaOrig="1170" w14:anchorId="1F0F21C8">
-                <v:shape id="_x0000_i1037" type="#_x0000_t75" style="width:65.25pt;height:58.5pt" o:ole="">
-                  <v:imagedata r:id="rId52" o:title=""/>
+                <v:shape id="_x0000_i1037" type="#_x0000_t75" style="width:65.05pt;height:58.1pt" o:ole="">
+                  <v:imagedata r:id="rId54" o:title=""/>
                 </v:shape>
-                <o:OLEObject Type="Embed" ProgID="PBrush" ShapeID="_x0000_i1037" DrawAspect="Content" ObjectID="_1832739339" r:id="rId53"/>
+                <o:OLEObject Type="Embed" ProgID="PBrush" ShapeID="_x0000_i1037" DrawAspect="Content" ObjectID="_1833353779" r:id="rId55"/>
               </w:object>
             </w:r>
           </w:p>
@@ -7335,10 +7471,10 @@
           <w:p>
             <w:r>
               <w:object w:dxaOrig="1395" w:dyaOrig="1290" w14:anchorId="0516A226">
-                <v:shape id="_x0000_i1050" type="#_x0000_t75" style="width:58.5pt;height:59.25pt" o:ole="">
-                  <v:imagedata r:id="rId54" o:title=""/>
+                <v:shape id="_x0000_i1038" type="#_x0000_t75" style="width:58.1pt;height:59pt" o:ole="">
+                  <v:imagedata r:id="rId56" o:title=""/>
                 </v:shape>
-                <o:OLEObject Type="Embed" ProgID="PBrush" ShapeID="_x0000_i1050" DrawAspect="Content" ObjectID="_1832739340" r:id="rId55"/>
+                <o:OLEObject Type="Embed" ProgID="PBrush" ShapeID="_x0000_i1038" DrawAspect="Content" ObjectID="_1833353780" r:id="rId57"/>
               </w:object>
             </w:r>
           </w:p>
@@ -7660,7 +7796,7 @@
                           <pic:cNvPicPr/>
                         </pic:nvPicPr>
                         <pic:blipFill>
-                          <a:blip r:embed="rId56"/>
+                          <a:blip r:embed="rId58"/>
                           <a:srcRect/>
                           <a:stretch>
                             <a:fillRect/>
@@ -7837,7 +7973,7 @@
                           <pic:cNvPicPr/>
                         </pic:nvPicPr>
                         <pic:blipFill>
-                          <a:blip r:embed="rId57"/>
+                          <a:blip r:embed="rId59"/>
                           <a:srcRect/>
                           <a:stretch>
                             <a:fillRect/>
@@ -7998,10 +8134,10 @@
             </w:pPr>
             <w:r>
               <w:object w:dxaOrig="1215" w:dyaOrig="1005" w14:anchorId="6F7BAE32">
-                <v:shape id="_x0000_i1038" type="#_x0000_t75" style="width:58.5pt;height:47.25pt" o:ole="">
-                  <v:imagedata r:id="rId58" o:title=""/>
+                <v:shape id="_x0000_i1039" type="#_x0000_t75" style="width:58.1pt;height:46.85pt" o:ole="">
+                  <v:imagedata r:id="rId60" o:title=""/>
                 </v:shape>
-                <o:OLEObject Type="Embed" ProgID="PBrush" ShapeID="_x0000_i1038" DrawAspect="Content" ObjectID="_1832739341" r:id="rId59"/>
+                <o:OLEObject Type="Embed" ProgID="PBrush" ShapeID="_x0000_i1039" DrawAspect="Content" ObjectID="_1833353781" r:id="rId61"/>
               </w:object>
             </w:r>
           </w:p>
@@ -8165,7 +8301,7 @@
                           <pic:cNvPicPr/>
                         </pic:nvPicPr>
                         <pic:blipFill>
-                          <a:blip r:embed="rId60"/>
+                          <a:blip r:embed="rId62"/>
                           <a:srcRect/>
                           <a:stretch>
                             <a:fillRect/>
@@ -8343,7 +8479,7 @@
                           <pic:cNvPicPr/>
                         </pic:nvPicPr>
                         <pic:blipFill>
-                          <a:blip r:embed="rId61"/>
+                          <a:blip r:embed="rId63"/>
                           <a:srcRect/>
                           <a:stretch>
                             <a:fillRect/>
@@ -8519,7 +8655,7 @@
                           <pic:cNvPicPr/>
                         </pic:nvPicPr>
                         <pic:blipFill>
-                          <a:blip r:embed="rId62"/>
+                          <a:blip r:embed="rId64"/>
                           <a:srcRect/>
                           <a:stretch>
                             <a:fillRect/>
@@ -8686,10 +8822,10 @@
             </w:pPr>
             <w:r>
               <w:object w:dxaOrig="1035" w:dyaOrig="855" w14:anchorId="65E68CBD">
-                <v:shape id="_x0000_i1039" type="#_x0000_t75" style="width:65.25pt;height:54.75pt" o:ole="">
-                  <v:imagedata r:id="rId63" o:title=""/>
+                <v:shape id="_x0000_i1040" type="#_x0000_t75" style="width:65.05pt;height:54.65pt" o:ole="">
+                  <v:imagedata r:id="rId65" o:title=""/>
                 </v:shape>
-                <o:OLEObject Type="Embed" ProgID="PBrush" ShapeID="_x0000_i1039" DrawAspect="Content" ObjectID="_1832739342" r:id="rId64"/>
+                <o:OLEObject Type="Embed" ProgID="PBrush" ShapeID="_x0000_i1040" DrawAspect="Content" ObjectID="_1833353782" r:id="rId66"/>
               </w:object>
             </w:r>
           </w:p>
@@ -8822,10 +8958,10 @@
             </w:pPr>
             <w:r>
               <w:object w:dxaOrig="1155" w:dyaOrig="825" w14:anchorId="7EBFAB99">
-                <v:shape id="_x0000_i1040" type="#_x0000_t75" style="width:68.25pt;height:48pt" o:ole="">
-                  <v:imagedata r:id="rId65" o:title=""/>
+                <v:shape id="_x0000_i1041" type="#_x0000_t75" style="width:68.55pt;height:47.7pt" o:ole="">
+                  <v:imagedata r:id="rId67" o:title=""/>
                 </v:shape>
-                <o:OLEObject Type="Embed" ProgID="PBrush" ShapeID="_x0000_i1040" DrawAspect="Content" ObjectID="_1832739343" r:id="rId66"/>
+                <o:OLEObject Type="Embed" ProgID="PBrush" ShapeID="_x0000_i1041" DrawAspect="Content" ObjectID="_1833353783" r:id="rId68"/>
               </w:object>
             </w:r>
           </w:p>
@@ -8958,10 +9094,10 @@
             </w:pPr>
             <w:r>
               <w:object w:dxaOrig="1140" w:dyaOrig="855" w14:anchorId="15787835">
-                <v:shape id="_x0000_i1041" type="#_x0000_t75" style="width:69.75pt;height:51.75pt" o:ole="">
-                  <v:imagedata r:id="rId67" o:title=""/>
+                <v:shape id="_x0000_i1042" type="#_x0000_t75" style="width:69.4pt;height:52.05pt" o:ole="">
+                  <v:imagedata r:id="rId69" o:title=""/>
                 </v:shape>
-                <o:OLEObject Type="Embed" ProgID="PBrush" ShapeID="_x0000_i1041" DrawAspect="Content" ObjectID="_1832739344" r:id="rId68"/>
+                <o:OLEObject Type="Embed" ProgID="PBrush" ShapeID="_x0000_i1042" DrawAspect="Content" ObjectID="_1833353784" r:id="rId70"/>
               </w:object>
             </w:r>
           </w:p>
@@ -9089,10 +9225,10 @@
           <w:p>
             <w:r>
               <w:object w:dxaOrig="1185" w:dyaOrig="840" w14:anchorId="2E34F307">
-                <v:shape id="_x0000_i1042" type="#_x0000_t75" style="width:1in;height:51pt" o:ole="">
-                  <v:imagedata r:id="rId69" o:title=""/>
+                <v:shape id="_x0000_i1043" type="#_x0000_t75" style="width:1in;height:51.2pt" o:ole="">
+                  <v:imagedata r:id="rId71" o:title=""/>
                 </v:shape>
-                <o:OLEObject Type="Embed" ProgID="PBrush" ShapeID="_x0000_i1042" DrawAspect="Content" ObjectID="_1832739345" r:id="rId70"/>
+                <o:OLEObject Type="Embed" ProgID="PBrush" ShapeID="_x0000_i1043" DrawAspect="Content" ObjectID="_1833353785" r:id="rId72"/>
               </w:object>
             </w:r>
           </w:p>
@@ -9218,10 +9354,10 @@
           <w:p>
             <w:r>
               <w:object w:dxaOrig="915" w:dyaOrig="780" w14:anchorId="2AB1231F">
-                <v:shape id="_x0000_i1043" type="#_x0000_t75" style="width:60pt;height:51.75pt" o:ole="">
-                  <v:imagedata r:id="rId71" o:title=""/>
+                <v:shape id="_x0000_i1044" type="#_x0000_t75" style="width:59.85pt;height:52.05pt" o:ole="">
+                  <v:imagedata r:id="rId73" o:title=""/>
                 </v:shape>
-                <o:OLEObject Type="Embed" ProgID="PBrush" ShapeID="_x0000_i1043" DrawAspect="Content" ObjectID="_1832739346" r:id="rId72"/>
+                <o:OLEObject Type="Embed" ProgID="PBrush" ShapeID="_x0000_i1044" DrawAspect="Content" ObjectID="_1833353786" r:id="rId74"/>
               </w:object>
             </w:r>
           </w:p>
@@ -9349,10 +9485,10 @@
           <w:p>
             <w:r>
               <w:object w:dxaOrig="1020" w:dyaOrig="945" w14:anchorId="683CE402">
-                <v:shape id="_x0000_i1044" type="#_x0000_t75" style="width:65.25pt;height:60.75pt" o:ole="">
-                  <v:imagedata r:id="rId73" o:title=""/>
+                <v:shape id="_x0000_i1045" type="#_x0000_t75" style="width:65.05pt;height:60.7pt" o:ole="">
+                  <v:imagedata r:id="rId75" o:title=""/>
                 </v:shape>
-                <o:OLEObject Type="Embed" ProgID="PBrush" ShapeID="_x0000_i1044" DrawAspect="Content" ObjectID="_1832739347" r:id="rId74"/>
+                <o:OLEObject Type="Embed" ProgID="PBrush" ShapeID="_x0000_i1045" DrawAspect="Content" ObjectID="_1833353787" r:id="rId76"/>
               </w:object>
             </w:r>
           </w:p>

</xml_diff>